<commit_message>
Update pipeline documentation for the two-gate version
Keyword count 121 -> 109; tier table rebuilt for the three real tiers (the
old "AND" tier no longer exists); new section on why searches run unstemmed;
and the relevance-scoring section rewritten as the two-axis Gate 2, with a
signal table listing every signal and its weight, plus the tied-vs-untied
rule, the publication-type vetoes and the review bar.

Co-Authored-By: Claude Opus 5 <noreply@anthropic.com>
</commit_message>
<xml_diff>
--- a/LSMS_Impact_Analysis_Pipeline_Documentation.docx
+++ b/LSMS_Impact_Analysis_Pipeline_Documentation.docx
@@ -399,7 +399,7 @@
         <w:spacing w:after="100"/>
       </w:pPr>
       <w:r>
-        <w:t>A confidence breakdown showing how each paper was matched and how strong its relevance score is.</w:t>
+        <w:t>A confidence breakdown showing how each paper was matched, and its identity and use scores.</w:t>
       </w:r>
     </w:p>
     <w:p>
@@ -615,7 +615,7 @@
         <w:spacing w:after="100"/>
       </w:pPr>
       <w:r>
-        <w:t>Every search term comes from the exact original keyword list the LSMS team already used in its Google Alerts tracker (the “Keywords ISA” and “Keywords HFPS” tabs), 121 terms in total, categorized into 10 survey families.</w:t>
+        <w:t>Every search term comes from the keyword list the LSMS team already used in its Google Alerts tracker (the “Keywords ISA” and “Keywords HFPS” tabs), 109 terms in total, organised into 10 survey families. A handful of entries were recategorised or dropped as duplicates during the rework — for example “The Uganda National Panel survey” could never match anything the shorter “Uganda National Panel Survey” did not already catch.</w:t>
       </w:r>
     </w:p>
     <w:p>
@@ -623,7 +623,24 @@
         <w:spacing w:after="100"/>
       </w:pPr>
       <w:r>
-        <w:t>These 121 keywords vary enormously in how ambiguous they are on their own. A phrase like “Uganda National Panel Survey” cannot reasonably appear outside LSMS-related work. A bare acronym like “IHS” appears in thousands of unrelated papers (health plans, hospital systems, and so on). Applying one filter to both extremes either throws away real papers or lets irrelevant papers in--so every keyword is classified into one of four tiers, each with its own rule:</w:t>
+        <w:t>These keywords vary enormously in how ambiguous they are on their own. A phrase like “Uganda National Panel Survey” cannot reasonably appear outside LSMS-related work. A bare acronym like “IHS” appears in thousands of unrelated papers (health plans, hospital systems, and so on). And some names are real survey titles whose words merely describe the survey rather than identify it — “National Panel Survey” is both Tanzania's and Uganda's, and every agency ran a “High-Frequency Phone Survey” during COVID. Applying one rule to all three either throws away real papers or lets irrelevant ones in, so every keyword carries one of three tiers:</w:t>
+      </w:r>
+    </w:p>
+    <w:p>
+      <w:pPr>
+        <w:pStyle w:val="Heading2"/>
+        <w:spacing w:after="100"/>
+      </w:pPr>
+      <w:r>
+        <w:t>2.3 Why searches are run unstemmed</w:t>
+      </w:r>
+    </w:p>
+    <w:p>
+      <w:pPr>
+        <w:spacing w:after="100"/>
+      </w:pPr>
+      <w:r>
+        <w:t>OpenAlex stems words by default, meaning a search for LSMS also matches LSM — the standard abbreviation for land-surface model and log-structured merge-tree. Stemmed, the bare “LSMS” query returned 13,506 hits for a single fiscal year; unstemmed it returns 698. Every Gate 1 query therefore goes out through OpenAlex's search.exact parameter, which bypasses stemming. Two caveats: search.exact is still case-insensitive (which is what the Tier C case check above is for), and a small NOT clause additionally excludes the known land-surface vocabulary from the bare LSMS query.</w:t>
       </w:r>
     </w:p>
     <w:tbl>
@@ -750,7 +767,7 @@
                 <w:sz w:val="18"/>
                 <w:szCs w:val="18"/>
               </w:rPr>
-              <w:t>65</w:t>
+              <w:t>38</w:t>
             </w:r>
           </w:p>
         </w:tc>
@@ -765,7 +782,7 @@
                 <w:sz w:val="18"/>
                 <w:szCs w:val="18"/>
               </w:rPr>
-              <w:t>“Uganda National Panel Survey”, “Living Standards Measurement Study”</w:t>
+              <w:t>“Uganda National Panel Survey”, “LSMS-ISA”, “EHCVM 2018”</w:t>
             </w:r>
           </w:p>
         </w:tc>
@@ -780,7 +797,7 @@
                 <w:sz w:val="18"/>
                 <w:szCs w:val="18"/>
               </w:rPr>
-              <w:t xml:space="preserve">Full-text match accepted </w:t>
+              <w:t>Unambiguous: the name contains a country, or an acronym that cannot plausibly mean anything else. A full-text match is accepted on its own — no country context and no field filter. Most genuine papers name their data source in the Methods section rather than the abstract, and OpenAlex indexes full text, so this is the tier that does most of the work.</w:t>
             </w:r>
             <w:r>
               <w:rPr>
@@ -788,7 +805,6 @@
                 <w:sz w:val="18"/>
                 <w:szCs w:val="18"/>
               </w:rPr>
-              <w:t xml:space="preserve">(i.e. </w:t>
             </w:r>
             <w:r>
               <w:rPr>
@@ -796,7 +812,6 @@
                 <w:sz w:val="18"/>
                 <w:szCs w:val="18"/>
               </w:rPr>
-              <w:t>no title/abstract requirement, no discipline filter</w:t>
             </w:r>
             <w:r>
               <w:rPr>
@@ -804,7 +819,6 @@
                 <w:sz w:val="18"/>
                 <w:szCs w:val="18"/>
               </w:rPr>
-              <w:t>)</w:t>
             </w:r>
             <w:r>
               <w:rPr>
@@ -812,7 +826,6 @@
                 <w:sz w:val="18"/>
                 <w:szCs w:val="18"/>
               </w:rPr>
-              <w:t>. These phrases are specific enough that they can't plausibly be false positives.</w:t>
             </w:r>
           </w:p>
         </w:tc>
@@ -844,7 +857,7 @@
                 <w:sz w:val="18"/>
                 <w:szCs w:val="18"/>
               </w:rPr>
-              <w:t>15</w:t>
+              <w:t>28</w:t>
             </w:r>
           </w:p>
         </w:tc>
@@ -859,7 +872,7 @@
                 <w:sz w:val="18"/>
                 <w:szCs w:val="18"/>
               </w:rPr>
-              <w:t>“LSMS-ISA”, “Tanzania NPS”, “GHS-Panel”</w:t>
+              <w:t>“National Panel Survey”, “High-Frequency Phone Survey”, “Living Standards Survey”</w:t>
             </w:r>
           </w:p>
         </w:tc>
@@ -874,7 +887,7 @@
                 <w:sz w:val="18"/>
                 <w:szCs w:val="18"/>
               </w:rPr>
-              <w:t>Must appear in the title or abstract specifically (not just anywhere in the full text).</w:t>
+              <w:t>A real survey name, but a generic one: the words describe the survey rather than identify it, and other countries or programmes use the same phrase. Requires an LSMS country word somewhere in the document AND an allowed subject field. Case-insensitive — casing carries no information in a phrase.</w:t>
             </w:r>
           </w:p>
         </w:tc>
@@ -906,7 +919,7 @@
                 <w:sz w:val="18"/>
                 <w:szCs w:val="18"/>
               </w:rPr>
-              <w:t>25</w:t>
+              <w:t>43</w:t>
             </w:r>
           </w:p>
         </w:tc>
@@ -921,7 +934,7 @@
                 <w:sz w:val="18"/>
                 <w:szCs w:val="18"/>
               </w:rPr>
-              <w:t>“IHPS”, “ESS1”, “UNPS”, “HFPS”</w:t>
+              <w:t>“IHPS”, “LSMS”, “UNPS”, “ESS4”</w:t>
             </w:r>
           </w:p>
         </w:tc>
@@ -936,7 +949,118 @@
                 <w:sz w:val="18"/>
                 <w:szCs w:val="18"/>
               </w:rPr>
-              <w:t>Case-sensitive, word-boundary match, plus a required country-context word nearby, plus a relevant-discipline check.</w:t>
+              <w:t>Short acronym. Same country and field gating as B, plus a case check: if the acronym appears in the title or abstract with the wrong casing (“LSMs”, the plural of land-surface model) that is a positive sign of a collision and the paper is dropped. If it does not appear there at all we cannot tell, and the query's own country gate stands.</w:t>
+            </w:r>
+          </w:p>
+        </w:tc>
+      </w:tr>
+    </w:tbl>
+    <w:p>
+      <w:pPr>
+        <w:pStyle w:val="Heading2"/>
+        <w:spacing w:before="180" w:after="80"/>
+      </w:pPr>
+      <w:r>
+        <w:t>2.4 Gate 2: is it our survey, and did they actually use it?</w:t>
+      </w:r>
+    </w:p>
+    <w:p>
+      <w:pPr>
+        <w:spacing w:after="100"/>
+      </w:pPr>
+      <w:r>
+        <w:t>Matching a keyword is necessary but not sufficient. Gate 2 asks two separate questions about every admitted paper, and scores them on two independent axes:</w:t>
+      </w:r>
+    </w:p>
+    <w:p>
+      <w:pPr>
+        <w:pStyle w:val="ListParagraph"/>
+        <w:spacing w:after="100"/>
+      </w:pPr>
+      <w:r>
+        <w:t>IDENTITY — is this really one of our surveys, or a name collision, or a different country's survey that happens to share a phrase?</w:t>
+      </w:r>
+    </w:p>
+    <w:p>
+      <w:pPr>
+        <w:pStyle w:val="ListParagraph"/>
+        <w:spacing w:after="100"/>
+      </w:pPr>
+      <w:r>
+        <w:t>USE — did the authors actually work with the microdata, or do they only mention it: cite it, credit it, list it as related work?</w:t>
+      </w:r>
+    </w:p>
+    <w:p>
+      <w:pPr>
+        <w:spacing w:after="100"/>
+      </w:pPr>
+      <w:r>
+        <w:t>A strong signal is worth 2 points and a weak one 1 point. A paper reaches the Papers sheet only if it scores at least 2 on IDENTITY and at least 2 on USE. Clearing one axis alone is never enough.</w:t>
+      </w:r>
+    </w:p>
+    <w:p>
+      <w:pPr>
+        <w:spacing w:after="100"/>
+      </w:pPr>
+      <w:r>
+        <w:t>Keeping the axes apart is the whole point. If the two were added into a single number, a paper could pass on identity alone: name the survey three times in an abstract, add a World Bank co-author, and a pure literature review would outscore a real empirical paper. Splitting them makes “mentions the survey but never uses the data” structurally unable to pass, which is exactly the failure the previous version had.</w:t>
+      </w:r>
+    </w:p>
+    <w:p>
+      <w:pPr>
+        <w:spacing w:after="100"/>
+      </w:pPr>
+      <w:r>
+        <w:t>Because 2 points are needed on each axis, the arithmetic is deliberately simple: one strong signal clears an axis on its own, two weak signals clear it together, and a single weak signal never does.</w:t>
+      </w:r>
+    </w:p>
+    <w:tbl>
+      <w:tblPr>
+        <w:tblW w:type="auto" w:w="0"/>
+        <w:tblLook w:firstColumn="1" w:firstRow="1" w:lastColumn="0" w:lastRow="0" w:noHBand="0" w:noVBand="1" w:val="04A0"/>
+      </w:tblPr>
+      <w:tblGrid>
+        <w:gridCol w:w="3480"/>
+        <w:gridCol w:w="3480"/>
+        <w:gridCol w:w="3480"/>
+      </w:tblGrid>
+      <w:tr>
+        <w:tc>
+          <w:tcPr>
+            <w:tcW w:type="dxa" w:w="3480"/>
+          </w:tcPr>
+          <w:p>
+            <w:r>
+              <w:rPr>
+                <w:b/>
+              </w:rPr>
+              <w:t>Axis</w:t>
+            </w:r>
+          </w:p>
+        </w:tc>
+        <w:tc>
+          <w:tcPr>
+            <w:tcW w:type="dxa" w:w="3480"/>
+          </w:tcPr>
+          <w:p>
+            <w:r>
+              <w:rPr>
+                <w:b/>
+              </w:rPr>
+              <w:t>Signal</w:t>
+            </w:r>
+          </w:p>
+        </w:tc>
+        <w:tc>
+          <w:tcPr>
+            <w:tcW w:type="dxa" w:w="3480"/>
+          </w:tcPr>
+          <w:p>
+            <w:r>
+              <w:rPr>
+                <w:b/>
+              </w:rPr>
+              <w:t>Weight</w:t>
             </w:r>
           </w:p>
         </w:tc>
@@ -944,79 +1068,479 @@
       <w:tr>
         <w:tc>
           <w:tcPr>
-            <w:tcW w:w="800" w:type="dxa"/>
-          </w:tcPr>
-          <w:p>
-            <w:r>
-              <w:rPr>
-                <w:color w:val="000000"/>
-                <w:sz w:val="18"/>
-                <w:szCs w:val="18"/>
-              </w:rPr>
-              <w:t>AND</w:t>
-            </w:r>
-          </w:p>
-        </w:tc>
-        <w:tc>
-          <w:tcPr>
-            <w:tcW w:w="1100" w:type="dxa"/>
-          </w:tcPr>
-          <w:p>
-            <w:r>
-              <w:rPr>
-                <w:color w:val="000000"/>
-                <w:sz w:val="18"/>
-                <w:szCs w:val="18"/>
-              </w:rPr>
-              <w:t>16</w:t>
-            </w:r>
-          </w:p>
-        </w:tc>
-        <w:tc>
-          <w:tcPr>
-            <w:tcW w:w="3450" w:type="dxa"/>
-          </w:tcPr>
-          <w:p>
-            <w:r>
-              <w:rPr>
-                <w:color w:val="000000"/>
-                <w:sz w:val="18"/>
-                <w:szCs w:val="18"/>
-              </w:rPr>
-              <w:t>“HFPS” and “Burkina Faso”</w:t>
-            </w:r>
-          </w:p>
-        </w:tc>
-        <w:tc>
-          <w:tcPr>
-            <w:tcW w:w="4995" w:type="dxa"/>
-          </w:tcPr>
-          <w:p>
-            <w:r>
-              <w:rPr>
-                <w:color w:val="000000"/>
-                <w:sz w:val="18"/>
-                <w:szCs w:val="18"/>
-              </w:rPr>
-              <w:t xml:space="preserve">Split into a </w:t>
-            </w:r>
-            <w:proofErr w:type="spellStart"/>
-            <w:r>
-              <w:rPr>
-                <w:color w:val="000000"/>
-                <w:sz w:val="18"/>
-                <w:szCs w:val="18"/>
-              </w:rPr>
-              <w:t>boolean</w:t>
-            </w:r>
-            <w:proofErr w:type="spellEnd"/>
-            <w:r>
-              <w:rPr>
-                <w:color w:val="000000"/>
-                <w:sz w:val="18"/>
-                <w:szCs w:val="18"/>
-              </w:rPr>
-              <w:t xml:space="preserve"> query; both the acronym and the country name must be present.</w:t>
+            <w:tcW w:type="dxa" w:w="3480"/>
+          </w:tcPr>
+          <w:p>
+            <w:r>
+              <w:t>Identity</w:t>
+            </w:r>
+          </w:p>
+        </w:tc>
+        <w:tc>
+          <w:tcPr>
+            <w:tcW w:type="dxa" w:w="3480"/>
+          </w:tcPr>
+          <w:p>
+            <w:r>
+              <w:t>A known survey name appears in the title</w:t>
+            </w:r>
+          </w:p>
+        </w:tc>
+        <w:tc>
+          <w:tcPr>
+            <w:tcW w:type="dxa" w:w="3480"/>
+          </w:tcPr>
+          <w:p>
+            <w:r>
+              <w:t>Strong (2)</w:t>
+            </w:r>
+          </w:p>
+        </w:tc>
+      </w:tr>
+      <w:tr>
+        <w:tc>
+          <w:tcPr>
+            <w:tcW w:type="dxa" w:w="3480"/>
+          </w:tcPr>
+          <w:p>
+            <w:r>
+              <w:t>Identity</w:t>
+            </w:r>
+          </w:p>
+        </w:tc>
+        <w:tc>
+          <w:tcPr>
+            <w:tcW w:type="dxa" w:w="3480"/>
+          </w:tcPr>
+          <w:p>
+            <w:r>
+              <w:t>A known survey name appears in the abstract</w:t>
+            </w:r>
+          </w:p>
+        </w:tc>
+        <w:tc>
+          <w:tcPr>
+            <w:tcW w:type="dxa" w:w="3480"/>
+          </w:tcPr>
+          <w:p>
+            <w:r>
+              <w:t>Strong (2)</w:t>
+            </w:r>
+          </w:p>
+        </w:tc>
+      </w:tr>
+      <w:tr>
+        <w:tc>
+          <w:tcPr>
+            <w:tcW w:type="dxa" w:w="3480"/>
+          </w:tcPr>
+          <w:p>
+            <w:r>
+              <w:t>Identity</w:t>
+            </w:r>
+          </w:p>
+        </w:tc>
+        <w:tc>
+          <w:tcPr>
+            <w:tcW w:type="dxa" w:w="3480"/>
+          </w:tcPr>
+          <w:p>
+            <w:r>
+              <w:t>Admitted on a Tier A (unambiguous) name</w:t>
+            </w:r>
+          </w:p>
+        </w:tc>
+        <w:tc>
+          <w:tcPr>
+            <w:tcW w:type="dxa" w:w="3480"/>
+          </w:tcPr>
+          <w:p>
+            <w:r>
+              <w:t>Strong (2)</w:t>
+            </w:r>
+          </w:p>
+        </w:tc>
+      </w:tr>
+      <w:tr>
+        <w:tc>
+          <w:tcPr>
+            <w:tcW w:type="dxa" w:w="3480"/>
+          </w:tcPr>
+          <w:p>
+            <w:r>
+              <w:t>Identity</w:t>
+            </w:r>
+          </w:p>
+        </w:tc>
+        <w:tc>
+          <w:tcPr>
+            <w:tcW w:type="dxa" w:w="3480"/>
+          </w:tcPr>
+          <w:p>
+            <w:r>
+              <w:t>Admitted only on a Tier B/C (generic or acronym) term</w:t>
+            </w:r>
+          </w:p>
+        </w:tc>
+        <w:tc>
+          <w:tcPr>
+            <w:tcW w:type="dxa" w:w="3480"/>
+          </w:tcPr>
+          <w:p>
+            <w:r>
+              <w:t>Weak (1)</w:t>
+            </w:r>
+          </w:p>
+        </w:tc>
+      </w:tr>
+      <w:tr>
+        <w:tc>
+          <w:tcPr>
+            <w:tcW w:type="dxa" w:w="3480"/>
+          </w:tcPr>
+          <w:p>
+            <w:r>
+              <w:t>Identity</w:t>
+            </w:r>
+          </w:p>
+        </w:tc>
+        <w:tc>
+          <w:tcPr>
+            <w:tcW w:type="dxa" w:w="3480"/>
+          </w:tcPr>
+          <w:p>
+            <w:r>
+              <w:t>Matched terms from two or more survey families</w:t>
+            </w:r>
+          </w:p>
+        </w:tc>
+        <w:tc>
+          <w:tcPr>
+            <w:tcW w:type="dxa" w:w="3480"/>
+          </w:tcPr>
+          <w:p>
+            <w:r>
+              <w:t>Strong (2)</w:t>
+            </w:r>
+          </w:p>
+        </w:tc>
+      </w:tr>
+      <w:tr>
+        <w:tc>
+          <w:tcPr>
+            <w:tcW w:type="dxa" w:w="3480"/>
+          </w:tcPr>
+          <w:p>
+            <w:r>
+              <w:t>Identity</w:t>
+            </w:r>
+          </w:p>
+        </w:tc>
+        <w:tc>
+          <w:tcPr>
+            <w:tcW w:type="dxa" w:w="3480"/>
+          </w:tcPr>
+          <w:p>
+            <w:r>
+              <w:t>Matched two or more term variants of one survey</w:t>
+            </w:r>
+          </w:p>
+        </w:tc>
+        <w:tc>
+          <w:tcPr>
+            <w:tcW w:type="dxa" w:w="3480"/>
+          </w:tcPr>
+          <w:p>
+            <w:r>
+              <w:t>Weak (1)</w:t>
+            </w:r>
+          </w:p>
+        </w:tc>
+      </w:tr>
+      <w:tr>
+        <w:tc>
+          <w:tcPr>
+            <w:tcW w:type="dxa" w:w="3480"/>
+          </w:tcPr>
+          <w:p>
+            <w:r>
+              <w:t>Identity</w:t>
+            </w:r>
+          </w:p>
+        </w:tc>
+        <w:tc>
+          <w:tcPr>
+            <w:tcW w:type="dxa" w:w="3480"/>
+          </w:tcPr>
+          <w:p>
+            <w:r>
+              <w:t>An LSMS country is named in the title or abstract</w:t>
+            </w:r>
+          </w:p>
+        </w:tc>
+        <w:tc>
+          <w:tcPr>
+            <w:tcW w:type="dxa" w:w="3480"/>
+          </w:tcPr>
+          <w:p>
+            <w:r>
+              <w:t>Weak (1)</w:t>
+            </w:r>
+          </w:p>
+        </w:tc>
+      </w:tr>
+      <w:tr>
+        <w:tc>
+          <w:tcPr>
+            <w:tcW w:type="dxa" w:w="3480"/>
+          </w:tcPr>
+          <w:p>
+            <w:r>
+              <w:t>Identity</w:t>
+            </w:r>
+          </w:p>
+        </w:tc>
+        <w:tc>
+          <w:tcPr>
+            <w:tcW w:type="dxa" w:w="3480"/>
+          </w:tcPr>
+          <w:p>
+            <w:r>
+              <w:t>The LSMS programme is named in the abstract</w:t>
+            </w:r>
+          </w:p>
+        </w:tc>
+        <w:tc>
+          <w:tcPr>
+            <w:tcW w:type="dxa" w:w="3480"/>
+          </w:tcPr>
+          <w:p>
+            <w:r>
+              <w:t>Weak (1)</w:t>
+            </w:r>
+          </w:p>
+        </w:tc>
+      </w:tr>
+      <w:tr>
+        <w:tc>
+          <w:tcPr>
+            <w:tcW w:type="dxa" w:w="3480"/>
+          </w:tcPr>
+          <w:p>
+            <w:r>
+              <w:t>Identity</w:t>
+            </w:r>
+          </w:p>
+        </w:tc>
+        <w:tc>
+          <w:tcPr>
+            <w:tcW w:type="dxa" w:w="3480"/>
+          </w:tcPr>
+          <w:p>
+            <w:r>
+              <w:t>A World Bank–affiliated author</w:t>
+            </w:r>
+          </w:p>
+        </w:tc>
+        <w:tc>
+          <w:tcPr>
+            <w:tcW w:type="dxa" w:w="3480"/>
+          </w:tcPr>
+          <w:p>
+            <w:r>
+              <w:t>Weak (1)</w:t>
+            </w:r>
+          </w:p>
+        </w:tc>
+      </w:tr>
+      <w:tr>
+        <w:tc>
+          <w:tcPr>
+            <w:tcW w:type="dxa" w:w="3480"/>
+          </w:tcPr>
+          <w:p>
+            <w:r>
+              <w:t>Use</w:t>
+            </w:r>
+          </w:p>
+        </w:tc>
+        <w:tc>
+          <w:tcPr>
+            <w:tcW w:type="dxa" w:w="3480"/>
+          </w:tcPr>
+          <w:p>
+            <w:r>
+              <w:t>Abstract names the survey AND uses explicit first-person data-use language (“we use”, “using data from”, “microdata”)</w:t>
+            </w:r>
+          </w:p>
+        </w:tc>
+        <w:tc>
+          <w:tcPr>
+            <w:tcW w:type="dxa" w:w="3480"/>
+          </w:tcPr>
+          <w:p>
+            <w:r>
+              <w:t>Strong (2)</w:t>
+            </w:r>
+          </w:p>
+        </w:tc>
+      </w:tr>
+      <w:tr>
+        <w:tc>
+          <w:tcPr>
+            <w:tcW w:type="dxa" w:w="3480"/>
+          </w:tcPr>
+          <w:p>
+            <w:r>
+              <w:t>Use</w:t>
+            </w:r>
+          </w:p>
+        </w:tc>
+        <w:tc>
+          <w:tcPr>
+            <w:tcW w:type="dxa" w:w="3480"/>
+          </w:tcPr>
+          <w:p>
+            <w:r>
+              <w:t>Abstract names the survey AND uses weaker data-source language</w:t>
+            </w:r>
+          </w:p>
+        </w:tc>
+        <w:tc>
+          <w:tcPr>
+            <w:tcW w:type="dxa" w:w="3480"/>
+          </w:tcPr>
+          <w:p>
+            <w:r>
+              <w:t>Weak (1)</w:t>
+            </w:r>
+          </w:p>
+        </w:tc>
+      </w:tr>
+      <w:tr>
+        <w:tc>
+          <w:tcPr>
+            <w:tcW w:type="dxa" w:w="3480"/>
+          </w:tcPr>
+          <w:p>
+            <w:r>
+              <w:t>Use</w:t>
+            </w:r>
+          </w:p>
+        </w:tc>
+        <w:tc>
+          <w:tcPr>
+            <w:tcW w:type="dxa" w:w="3480"/>
+          </w:tcPr>
+          <w:p>
+            <w:r>
+              <w:t>Full text: first-person data-use language within 40 words of the survey name (also grants +1 identity)</w:t>
+            </w:r>
+          </w:p>
+        </w:tc>
+        <w:tc>
+          <w:tcPr>
+            <w:tcW w:type="dxa" w:w="3480"/>
+          </w:tcPr>
+          <w:p>
+            <w:r>
+              <w:t>Strong (2)</w:t>
+            </w:r>
+          </w:p>
+        </w:tc>
+      </w:tr>
+      <w:tr>
+        <w:tc>
+          <w:tcPr>
+            <w:tcW w:type="dxa" w:w="3480"/>
+          </w:tcPr>
+          <w:p>
+            <w:r>
+              <w:t>Use</w:t>
+            </w:r>
+          </w:p>
+        </w:tc>
+        <w:tc>
+          <w:tcPr>
+            <w:tcW w:type="dxa" w:w="3480"/>
+          </w:tcPr>
+          <w:p>
+            <w:r>
+              <w:t>Full text: data-object language near the survey name</w:t>
+            </w:r>
+          </w:p>
+        </w:tc>
+        <w:tc>
+          <w:tcPr>
+            <w:tcW w:type="dxa" w:w="3480"/>
+          </w:tcPr>
+          <w:p>
+            <w:r>
+              <w:t>Weak (1)</w:t>
+            </w:r>
+          </w:p>
+        </w:tc>
+      </w:tr>
+      <w:tr>
+        <w:tc>
+          <w:tcPr>
+            <w:tcW w:type="dxa" w:w="3480"/>
+          </w:tcPr>
+          <w:p>
+            <w:r>
+              <w:t>Use</w:t>
+            </w:r>
+          </w:p>
+        </w:tc>
+        <w:tc>
+          <w:tcPr>
+            <w:tcW w:type="dxa" w:w="3480"/>
+          </w:tcPr>
+          <w:p>
+            <w:r>
+              <w:t>Full text: who ran, funded or implemented the survey, near its name</w:t>
+            </w:r>
+          </w:p>
+        </w:tc>
+        <w:tc>
+          <w:tcPr>
+            <w:tcW w:type="dxa" w:w="3480"/>
+          </w:tcPr>
+          <w:p>
+            <w:r>
+              <w:t>Weak (1)</w:t>
+            </w:r>
+          </w:p>
+        </w:tc>
+      </w:tr>
+      <w:tr>
+        <w:tc>
+          <w:tcPr>
+            <w:tcW w:type="dxa" w:w="3480"/>
+          </w:tcPr>
+          <w:p>
+            <w:r>
+              <w:t>Use</w:t>
+            </w:r>
+          </w:p>
+        </w:tc>
+        <w:tc>
+          <w:tcPr>
+            <w:tcW w:type="dxa" w:w="3480"/>
+          </w:tcPr>
+          <w:p>
+            <w:r>
+              <w:t>Untied evidence: empirical vocabulary, or data-use language with no survey named</w:t>
+            </w:r>
+          </w:p>
+        </w:tc>
+        <w:tc>
+          <w:tcPr>
+            <w:tcW w:type="dxa" w:w="3480"/>
+          </w:tcPr>
+          <w:p>
+            <w:r>
+              <w:t>Capped at 1 total</w:t>
             </w:r>
           </w:p>
         </w:tc>
@@ -1024,11 +1548,51 @@
     </w:tbl>
     <w:p>
       <w:pPr>
+        <w:spacing w:after="100"/>
+      </w:pPr>
+      <w:r>
+        <w:t>TIED versus UNTIED use evidence. This is the subtlety that makes the use axis mean anything. An abstract saying “we use household survey data” proves the authors used some data — not that they used ours. Only evidence that ties the use language to the survey itself counts in full: either the full-text pass finds the two within 40 words of each other, or the abstract both names the survey and describes using data. Generic evidence that is not tied to any particular survey (empirical vocabulary such as “regression” or “household”, or data-use language with no survey named) is capped at 1 point in total, so it can corroborate a real signal but can never carry the axis by itself.</w:t>
+      </w:r>
+    </w:p>
+    <w:p>
+      <w:pPr>
+        <w:spacing w:after="100"/>
+      </w:pPr>
+      <w:r>
+        <w:t>The full-text pass (Gate 2b) is a second, separate step that runs only for papers whose USE score is still short — note, the use axis specifically, not the total. A paper can sit on a mountain of identity evidence and still show nothing about whether the data was used, and that is precisely the paper worth spending an API call on. It asks OpenAlex whether the paper's own matched survey name sits within 40 words of language describing working with the data.</w:t>
+      </w:r>
+    </w:p>
+    <w:p>
+      <w:pPr>
+        <w:spacing w:after="100"/>
+      </w:pPr>
+      <w:r>
+        <w:t>The phrases it looks for were chosen by measurement, not intuition: every candidate was run against a 36-paper review set and scored on how many genuine users versus non-users it caught. “Using data from” separates cleanly (8 real users against 1 non-user); “this paper uses” and “based on the” turned out to be negative indicators, hitting more citations than real uses, and were removed. Citing the World Bank microdata catalogue scored 2 against 2 — no separating power at all — so it is searched and reported as a flag on the paper, but earns no points.</w:t>
+      </w:r>
+    </w:p>
+    <w:p>
+      <w:pPr>
+        <w:spacing w:after="100"/>
+      </w:pPr>
+      <w:r>
+        <w:t>Two rules sit outside the points. First, six publication types can never be an empirical use of survey data and are excluded outright: conference abstract, dataset, paratext, erratum, letter and software. (Editorials are deliberately not on that list.) Second, papers written as literature reviews are flagged and held to a higher bar — a review that genuinely re-analyses the microdata still passes, but it must show a strong tied use signal rather than accumulating weak ones, because reviews are the single largest category of papers that mention a survey without using it.</w:t>
+      </w:r>
+    </w:p>
+    <w:p>
+      <w:pPr>
+        <w:spacing w:after="100"/>
+      </w:pPr>
+      <w:r>
+        <w:t>Every signal that fired is written to the relevance_flags column, and the two axis scores to identity_score and use_score, so any decision can be traced back to its reasons.</w:t>
+      </w:r>
+    </w:p>
+    <w:p>
+      <w:pPr>
         <w:pStyle w:val="Heading2"/>
         <w:spacing w:before="180" w:after="80"/>
       </w:pPr>
       <w:r>
-        <w:t>2.3 Validation: relevance scoring</w:t>
+        <w:t>2.5 Deduplication</w:t>
       </w:r>
     </w:p>
     <w:p>
@@ -1036,7 +1600,7 @@
         <w:spacing w:after="100"/>
       </w:pPr>
       <w:r>
-        <w:t>Matching a keyword is necessary but not sufficient: the pipeline then scores each matched paper's relevance from 0 to 3 based on how strongly the paper's title, abstract, and match context indicate genuine dataset use (as opposed to, say, a passing citation). Papers scoring 0 or 1 are excluded and written to a separate Not Relevant (Backup) sheet.</w:t>
+        <w:t>Before anything is counted, candidate papers are checked against each other by normalized title and, where available, DOI. Exact matches are merged automatically.</w:t>
       </w:r>
     </w:p>
     <w:p>
@@ -1045,24 +1609,7 @@
         <w:spacing w:before="180" w:after="80"/>
       </w:pPr>
       <w:r>
-        <w:t>2.4 Deduplication</w:t>
-      </w:r>
-    </w:p>
-    <w:p>
-      <w:pPr>
-        <w:spacing w:after="100"/>
-      </w:pPr>
-      <w:r>
-        <w:t>Before anything is counted, candidate papers are checked against each other by normalized title and, where available, DOI. Exact matches are merged automatically.</w:t>
-      </w:r>
-    </w:p>
-    <w:p>
-      <w:pPr>
-        <w:pStyle w:val="Heading2"/>
-        <w:spacing w:before="180" w:after="80"/>
-      </w:pPr>
-      <w:r>
-        <w:t>2.5 Fiscal year and geography</w:t>
+        <w:t>2.6 Fiscal year and geography</w:t>
       </w:r>
     </w:p>
     <w:p>
@@ -1138,7 +1685,7 @@
         <w:spacing w:before="180" w:after="80"/>
       </w:pPr>
       <w:r>
-        <w:t>2.6 What it outputs</w:t>
+        <w:t>2.7 What it outputs</w:t>
       </w:r>
     </w:p>
     <w:p>
@@ -1242,7 +1789,7 @@
                 <w:sz w:val="18"/>
                 <w:szCs w:val="18"/>
               </w:rPr>
-              <w:t xml:space="preserve">One row per discovered paper: title, DOI, authors, institutional affiliations, publication year/FY, </w:t>
+              <w:t>One row per discovered paper: title, DOI, authors, institutional affiliations, publication year/FY, dataset country, research topic, peer-reviewed / working-paper flag, journal tier, the identity and use scores, and the individual signals that fired (relevance_flags).</w:t>
             </w:r>
             <w:r>
               <w:rPr>
@@ -1250,7 +1797,6 @@
                 <w:sz w:val="18"/>
                 <w:szCs w:val="18"/>
               </w:rPr>
-              <w:t>dataset country, research topic, peer-reviewed / working paper</w:t>
             </w:r>
             <w:r>
               <w:rPr>
@@ -1258,7 +1804,6 @@
                 <w:sz w:val="18"/>
                 <w:szCs w:val="18"/>
               </w:rPr>
-              <w:t xml:space="preserve">, </w:t>
             </w:r>
             <w:r>
               <w:rPr>
@@ -1266,7 +1811,6 @@
                 <w:sz w:val="18"/>
                 <w:szCs w:val="18"/>
               </w:rPr>
-              <w:t>match tier, and relevance score</w:t>
             </w:r>
             <w:r>
               <w:rPr>
@@ -1274,14 +1818,12 @@
                 <w:sz w:val="18"/>
                 <w:szCs w:val="18"/>
               </w:rPr>
-              <w:t xml:space="preserve">, etc. </w:t>
-            </w:r>
-            <w:r>
-              <w:rPr>
-                <w:sz w:val="18"/>
-                <w:szCs w:val="18"/>
-              </w:rPr>
-              <w:t>Papers are sorted by fiscal year descending, then alphabetically within each FY.</w:t>
+            </w:r>
+            <w:r>
+              <w:rPr>
+                <w:sz w:val="18"/>
+                <w:szCs w:val="18"/>
+              </w:rPr>
             </w:r>
           </w:p>
         </w:tc>
@@ -1313,7 +1855,7 @@
                 <w:sz w:val="18"/>
                 <w:szCs w:val="18"/>
               </w:rPr>
-              <w:t>The headline FLOW and Africa-SHARE numbers, a breakdown by match tier and relevance score, and the summary charts. Charts sit near the top of the sheet, next to the data, so they're the first thing visible.</w:t>
+              <w:t>The headline FLOW and Africa-SHARE numbers, a breakdown by match tier (strongest tier per paper, so the three sum to 100%) and by the identity/use axes, plus the summary charts. Charts sit near the top of the sheet.</w:t>
             </w:r>
           </w:p>
         </w:tc>
@@ -1377,7 +1919,7 @@
                 <w:sz w:val="18"/>
                 <w:szCs w:val="18"/>
               </w:rPr>
-              <w:t xml:space="preserve">All 121 original keywords, each with its tier, the matching rule applied, and the exact </w:t>
+              <w:t>All 109 keywords, each with its tier, the matching rule applied, the required country context words, and the exact OpenAlex query sent, so any result can be traced back to the search that found it.</w:t>
             </w:r>
             <w:proofErr w:type="spellStart"/>
             <w:r>
@@ -1386,7 +1928,6 @@
                 <w:sz w:val="18"/>
                 <w:szCs w:val="18"/>
               </w:rPr>
-              <w:t>OpenAlex</w:t>
             </w:r>
             <w:proofErr w:type="spellEnd"/>
             <w:r>
@@ -1395,7 +1936,6 @@
                 <w:sz w:val="18"/>
                 <w:szCs w:val="18"/>
               </w:rPr>
-              <w:t xml:space="preserve"> query sent</w:t>
             </w:r>
             <w:r>
               <w:rPr>
@@ -1403,7 +1943,6 @@
                 <w:sz w:val="18"/>
                 <w:szCs w:val="18"/>
               </w:rPr>
-              <w:t>,</w:t>
             </w:r>
             <w:r>
               <w:rPr>
@@ -1411,7 +1950,6 @@
                 <w:sz w:val="18"/>
                 <w:szCs w:val="18"/>
               </w:rPr>
-              <w:t xml:space="preserve"> so any result can be traced back to the search that found it.</w:t>
             </w:r>
           </w:p>
         </w:tc>

</xml_diff>

<commit_message>
Make the pipeline documentation presentation-ready
Adds an executive summary that leads with the argument rather than the
history: the pipeline separates "is this our survey" from "did they use the
data" and requires both, which is what stops a paper passing on name
recognition alone. Carries the figures that make the case (13,506 stemmed
results against 698 unstemmed, agreement on 22 of 28 review papers, about
$1.60 per run) and an at-a-glance summary table.

Adds section 2.8 stating the two known limits honestly: reference-only
matches that proximity cannot separate from real use, and data statements
OpenAlex has not indexed. Records that section-aware full text was tested
and rejected on coverage rather than left unexamined.

Both new tables use the styling already in the document (10075 dxa, single
4pt borders, 4C94D8 header fill, bold white 9pt header runs), and the signal
table added earlier is brought into the same style. Removes every em dash.
</commit_message>
<xml_diff>
--- a/LSMS_Impact_Analysis_Pipeline_Documentation.docx
+++ b/LSMS_Impact_Analysis_Pipeline_Documentation.docx
@@ -42,6 +42,370 @@
         <w:t>Full documentation and user guide</w:t>
       </w:r>
     </w:p>
+    <w:p>
+      <w:pPr>
+        <w:pStyle w:val="Heading1"/>
+        <w:spacing w:after="240"/>
+        <w:rPr>
+          <w:i/>
+          <w:iCs/>
+          <w:color w:val="555555"/>
+          <w:sz w:val="21"/>
+          <w:szCs w:val="21"/>
+        </w:rPr>
+      </w:pPr>
+      <w:r>
+        <w:t>Executive Summary</w:t>
+      </w:r>
+    </w:p>
+    <w:p>
+      <w:pPr>
+        <w:spacing w:after="240"/>
+        <w:rPr>
+          <w:i/>
+          <w:iCs/>
+          <w:color w:val="555555"/>
+          <w:sz w:val="21"/>
+          <w:szCs w:val="21"/>
+        </w:rPr>
+      </w:pPr>
+      <w:r>
+        <w:rPr>
+          <w:b w:val="0"/>
+        </w:rPr>
+        <w:t xml:space="preserve">The pipeline answers one question at scale: which published research actually uses LSMS data? It searches OpenAlex, the largest open index of scholarly work, for 109 survey keywords across 10 survey families, and then decides, paper by paper, whether the match reflects genuine use of the data or only a passing mention. </w:t>
+      </w:r>
+      <w:r>
+        <w:rPr>
+          <w:b/>
+        </w:rPr>
+        <w:t>The central design choice is that those are two separate questions, scored separately.</w:t>
+      </w:r>
+    </w:p>
+    <w:p>
+      <w:pPr>
+        <w:spacing w:after="240"/>
+        <w:rPr>
+          <w:i/>
+          <w:iCs/>
+          <w:color w:val="555555"/>
+          <w:sz w:val="21"/>
+          <w:szCs w:val="21"/>
+        </w:rPr>
+      </w:pPr>
+      <w:r>
+        <w:rPr>
+          <w:b w:val="0"/>
+        </w:rPr>
+        <w:t xml:space="preserve">Earlier versions collapsed them into a single relevance score, which let a paper pass on name recognition alone. A literature review naming the survey three times, written by a World Bank author, outscored a real empirical study. The current version scores an </w:t>
+      </w:r>
+      <w:r>
+        <w:rPr>
+          <w:b/>
+        </w:rPr>
+        <w:t>identity</w:t>
+      </w:r>
+      <w:r>
+        <w:rPr>
+          <w:b w:val="0"/>
+        </w:rPr>
+        <w:t xml:space="preserve"> axis (is this genuinely one of our surveys?) and a </w:t>
+      </w:r>
+      <w:r>
+        <w:rPr>
+          <w:b/>
+        </w:rPr>
+        <w:t>use</w:t>
+      </w:r>
+      <w:r>
+        <w:rPr>
+          <w:b w:val="0"/>
+        </w:rPr>
+        <w:t xml:space="preserve"> axis (did the authors work with the microdata?) independently, and a paper reaches the results only if it clears both. This makes “mentions the survey but never uses the data” structurally unable to pass, which is what the previous design could not guarantee.</w:t>
+      </w:r>
+    </w:p>
+    <w:p>
+      <w:pPr>
+        <w:spacing w:after="240"/>
+        <w:rPr>
+          <w:i/>
+          <w:iCs/>
+          <w:color w:val="555555"/>
+          <w:sz w:val="21"/>
+          <w:szCs w:val="21"/>
+        </w:rPr>
+      </w:pPr>
+      <w:r>
+        <w:rPr>
+          <w:b w:val="0"/>
+        </w:rPr>
+        <w:t xml:space="preserve">Two further decisions matter for accuracy. Searches run unstemmed, because OpenAlex by default treats LSMS and LSM as the same word and returns the entire land-surface model literature: 13,506 results for a single fiscal year against 698 unstemmed. And the phrase lists that detect data use were selected by measurement against a 36-paper review set rather than by intuition, which removed three phrases that turned out to indicate citation rather than use. </w:t>
+      </w:r>
+      <w:r>
+        <w:rPr>
+          <w:b/>
+        </w:rPr>
+        <w:t>Against that review set the pipeline now agrees with manual assessment on 22 of 28 papers, at a cost of roughly $1.60 per full run.</w:t>
+      </w:r>
+    </w:p>
+    <w:p>
+      <w:pPr>
+        <w:spacing w:after="240"/>
+        <w:rPr>
+          <w:i/>
+          <w:iCs/>
+          <w:color w:val="555555"/>
+          <w:sz w:val="21"/>
+          <w:szCs w:val="21"/>
+        </w:rPr>
+      </w:pPr>
+      <w:r>
+        <w:rPr>
+          <w:b w:val="0"/>
+        </w:rPr>
+        <w:t>The remaining disagreements are understood rather than mysterious. They divide into papers whose survey name appears only in the reference list, and papers whose data use is declared in a table or dataset section that OpenAlex does not index. Both limits are set out in section 2.8.</w:t>
+      </w:r>
+    </w:p>
+    <w:tbl>
+      <w:tblPr>
+        <w:tblW w:w="10075" w:type="dxa"/>
+        <w:tblBorders>
+          <w:top w:val="single" w:sz="4" w:space="0" w:color="auto"/>
+          <w:left w:val="single" w:sz="4" w:space="0" w:color="auto"/>
+          <w:bottom w:val="single" w:sz="4" w:space="0" w:color="auto"/>
+          <w:right w:val="single" w:sz="4" w:space="0" w:color="auto"/>
+          <w:insideH w:val="single" w:sz="4" w:space="0" w:color="auto"/>
+          <w:insideV w:val="single" w:sz="4" w:space="0" w:color="auto"/>
+        </w:tblBorders>
+        <w:tblCellMar>
+          <w:left w:w="10" w:type="dxa"/>
+          <w:right w:w="10" w:type="dxa"/>
+        </w:tblCellMar>
+        <w:tblLook w:val="0000" w:firstRow="0" w:lastRow="0" w:firstColumn="0" w:lastColumn="0" w:noHBand="0" w:noVBand="0"/>
+      </w:tblPr>
+      <w:tblGrid>
+        <w:gridCol w:w="5220"/>
+        <w:gridCol w:w="5220"/>
+      </w:tblGrid>
+      <w:tr>
+        <w:tc>
+          <w:tcPr>
+            <w:tcW w:w="2400" w:type="dxa"/>
+            <w:shd w:val="clear" w:color="auto" w:fill="4C94D8" w:themeFill="text2" w:themeFillTint="80"/>
+          </w:tcPr>
+          <w:p>
+            <w:r>
+              <w:rPr>
+                <w:b/>
+                <w:bCs/>
+                <w:color w:val="FFFFFF"/>
+                <w:sz w:val="18"/>
+                <w:szCs w:val="18"/>
+              </w:rPr>
+              <w:t>At a glance</w:t>
+            </w:r>
+          </w:p>
+        </w:tc>
+        <w:tc>
+          <w:tcPr>
+            <w:tcW w:w="7675" w:type="dxa"/>
+            <w:shd w:val="clear" w:color="auto" w:fill="4C94D8" w:themeFill="text2" w:themeFillTint="80"/>
+          </w:tcPr>
+          <w:p>
+            <w:r>
+              <w:rPr>
+                <w:b/>
+                <w:bCs/>
+                <w:color w:val="FFFFFF"/>
+                <w:sz w:val="18"/>
+                <w:szCs w:val="18"/>
+              </w:rPr>
+              <w:t>Summary</w:t>
+            </w:r>
+          </w:p>
+        </w:tc>
+      </w:tr>
+      <w:tr>
+        <w:tc>
+          <w:tcPr>
+            <w:tcW w:w="2400" w:type="dxa"/>
+          </w:tcPr>
+          <w:p>
+            <w:r>
+              <w:rPr>
+                <w:sz w:val="18"/>
+                <w:szCs w:val="18"/>
+              </w:rPr>
+              <w:t>What it measures</w:t>
+            </w:r>
+          </w:p>
+        </w:tc>
+        <w:tc>
+          <w:tcPr>
+            <w:tcW w:w="7675" w:type="dxa"/>
+          </w:tcPr>
+          <w:p>
+            <w:r>
+              <w:rPr>
+                <w:sz w:val="18"/>
+                <w:szCs w:val="18"/>
+              </w:rPr>
+              <w:t>TOTAL, FLOW and SHARE: papers using LSMS data, new papers per WBG fiscal year, and the share with African-affiliated authors</w:t>
+            </w:r>
+          </w:p>
+        </w:tc>
+      </w:tr>
+      <w:tr>
+        <w:tc>
+          <w:tcPr>
+            <w:tcW w:w="2400" w:type="dxa"/>
+          </w:tcPr>
+          <w:p>
+            <w:r>
+              <w:rPr>
+                <w:sz w:val="18"/>
+                <w:szCs w:val="18"/>
+              </w:rPr>
+              <w:t>Where it searches</w:t>
+            </w:r>
+          </w:p>
+        </w:tc>
+        <w:tc>
+          <w:tcPr>
+            <w:tcW w:w="7675" w:type="dxa"/>
+          </w:tcPr>
+          <w:p>
+            <w:r>
+              <w:rPr>
+                <w:sz w:val="18"/>
+                <w:szCs w:val="18"/>
+              </w:rPr>
+              <w:t>OpenAlex, covering journal articles, working papers, preprints and grey literature, searched against title, abstract and full text</w:t>
+            </w:r>
+          </w:p>
+        </w:tc>
+      </w:tr>
+      <w:tr>
+        <w:tc>
+          <w:tcPr>
+            <w:tcW w:w="2400" w:type="dxa"/>
+          </w:tcPr>
+          <w:p>
+            <w:r>
+              <w:rPr>
+                <w:sz w:val="18"/>
+                <w:szCs w:val="18"/>
+              </w:rPr>
+              <w:t>How it matches</w:t>
+            </w:r>
+          </w:p>
+        </w:tc>
+        <w:tc>
+          <w:tcPr>
+            <w:tcW w:w="7675" w:type="dxa"/>
+          </w:tcPr>
+          <w:p>
+            <w:r>
+              <w:rPr>
+                <w:sz w:val="18"/>
+                <w:szCs w:val="18"/>
+              </w:rPr>
+              <w:t>109 keywords in 10 survey families, each on one of three tiers according to how ambiguous the name is on its own</w:t>
+            </w:r>
+          </w:p>
+        </w:tc>
+      </w:tr>
+      <w:tr>
+        <w:tc>
+          <w:tcPr>
+            <w:tcW w:w="2400" w:type="dxa"/>
+          </w:tcPr>
+          <w:p>
+            <w:r>
+              <w:rPr>
+                <w:sz w:val="18"/>
+                <w:szCs w:val="18"/>
+              </w:rPr>
+              <w:t>How it decides</w:t>
+            </w:r>
+          </w:p>
+        </w:tc>
+        <w:tc>
+          <w:tcPr>
+            <w:tcW w:w="7675" w:type="dxa"/>
+          </w:tcPr>
+          <w:p>
+            <w:r>
+              <w:rPr>
+                <w:sz w:val="18"/>
+                <w:szCs w:val="18"/>
+              </w:rPr>
+              <w:t>Two independent axes, identity and use, each scored on a 2-point threshold; a paper must clear both</w:t>
+            </w:r>
+          </w:p>
+        </w:tc>
+      </w:tr>
+      <w:tr>
+        <w:tc>
+          <w:tcPr>
+            <w:tcW w:w="2400" w:type="dxa"/>
+          </w:tcPr>
+          <w:p>
+            <w:r>
+              <w:rPr>
+                <w:sz w:val="18"/>
+                <w:szCs w:val="18"/>
+              </w:rPr>
+              <w:t>What it produces</w:t>
+            </w:r>
+          </w:p>
+        </w:tc>
+        <w:tc>
+          <w:tcPr>
+            <w:tcW w:w="7675" w:type="dxa"/>
+          </w:tcPr>
+          <w:p>
+            <w:r>
+              <w:rPr>
+                <w:sz w:val="18"/>
+                <w:szCs w:val="18"/>
+              </w:rPr>
+              <w:t>One Excel workbook: results, analysis with charts, keyword register, search audit trail, and every rejected paper with the reason</w:t>
+            </w:r>
+          </w:p>
+        </w:tc>
+      </w:tr>
+      <w:tr>
+        <w:tc>
+          <w:tcPr>
+            <w:tcW w:w="2400" w:type="dxa"/>
+          </w:tcPr>
+          <w:p>
+            <w:r>
+              <w:rPr>
+                <w:sz w:val="18"/>
+                <w:szCs w:val="18"/>
+              </w:rPr>
+              <w:t>What it costs</w:t>
+            </w:r>
+          </w:p>
+        </w:tc>
+        <w:tc>
+          <w:tcPr>
+            <w:tcW w:w="7675" w:type="dxa"/>
+          </w:tcPr>
+          <w:p>
+            <w:r>
+              <w:rPr>
+                <w:sz w:val="18"/>
+                <w:szCs w:val="18"/>
+              </w:rPr>
+              <w:t>About $1.60 per full run; free tier allows roughly two runs per day</w:t>
+            </w:r>
+          </w:p>
+        </w:tc>
+      </w:tr>
+    </w:tbl>
     <w:p>
       <w:pPr>
         <w:pStyle w:val="Heading1"/>
@@ -615,7 +979,7 @@
         <w:spacing w:after="100"/>
       </w:pPr>
       <w:r>
-        <w:t>Every search term comes from the keyword list the LSMS team already used in its Google Alerts tracker (the “Keywords ISA” and “Keywords HFPS” tabs), 109 terms in total, organised into 10 survey families. A handful of entries were recategorised or dropped as duplicates during the rework — for example “The Uganda National Panel survey” could never match anything the shorter “Uganda National Panel Survey” did not already catch.</w:t>
+        <w:t>Every search term comes from the keyword list the LSMS team already used in its Google Alerts tracker (the “Keywords ISA” and “Keywords HFPS” tabs), 109 terms in total, organised into 10 survey families. A handful of entries were recategorised or dropped as duplicates during the rework – for example “The Uganda National Panel survey” could never match anything the shorter “Uganda National Panel Survey” did not already catch.</w:t>
       </w:r>
     </w:p>
     <w:p>
@@ -623,7 +987,7 @@
         <w:spacing w:after="100"/>
       </w:pPr>
       <w:r>
-        <w:t>These keywords vary enormously in how ambiguous they are on their own. A phrase like “Uganda National Panel Survey” cannot reasonably appear outside LSMS-related work. A bare acronym like “IHS” appears in thousands of unrelated papers (health plans, hospital systems, and so on). And some names are real survey titles whose words merely describe the survey rather than identify it — “National Panel Survey” is both Tanzania's and Uganda's, and every agency ran a “High-Frequency Phone Survey” during COVID. Applying one rule to all three either throws away real papers or lets irrelevant ones in, so every keyword carries one of three tiers:</w:t>
+        <w:t>These keywords vary enormously in how ambiguous they are on their own. A phrase like “Uganda National Panel Survey” cannot reasonably appear outside LSMS-related work. A bare acronym like “IHS” appears in thousands of unrelated papers (health plans, hospital systems, and so on). And some names are real survey titles whose words merely describe the survey rather than identify it – “National Panel Survey” is both Tanzania's and Uganda's, and every agency ran a “High-Frequency Phone Survey” during COVID. Applying one rule to all three either throws away real papers or lets irrelevant ones in, so every keyword carries one of three tiers:</w:t>
       </w:r>
     </w:p>
     <w:p>
@@ -640,7 +1004,7 @@
         <w:spacing w:after="100"/>
       </w:pPr>
       <w:r>
-        <w:t>OpenAlex stems words by default, meaning a search for LSMS also matches LSM — the standard abbreviation for land-surface model and log-structured merge-tree. Stemmed, the bare “LSMS” query returned 13,506 hits for a single fiscal year; unstemmed it returns 698. Every Gate 1 query therefore goes out through OpenAlex's search.exact parameter, which bypasses stemming. Two caveats: search.exact is still case-insensitive (which is what the Tier C case check above is for), and a small NOT clause additionally excludes the known land-surface vocabulary from the bare LSMS query.</w:t>
+        <w:t>OpenAlex stems words by default, meaning a search for LSMS also matches LSM – the standard abbreviation for land-surface model and log-structured merge-tree. Stemmed, the bare “LSMS” query returned 13,506 hits for a single fiscal year; unstemmed it returns 698. Every Gate 1 query therefore goes out through OpenAlex's search.exact parameter, which bypasses stemming. Two caveats: search.exact is still case-insensitive (which is what the Tier C case check above is for), and a small NOT clause additionally excludes the known land-surface vocabulary from the bare LSMS query.</w:t>
       </w:r>
     </w:p>
     <w:tbl>
@@ -797,7 +1161,7 @@
                 <w:sz w:val="18"/>
                 <w:szCs w:val="18"/>
               </w:rPr>
-              <w:t>Unambiguous: the name contains a country, or an acronym that cannot plausibly mean anything else. A full-text match is accepted on its own — no country context and no field filter. Most genuine papers name their data source in the Methods section rather than the abstract, and OpenAlex indexes full text, so this is the tier that does most of the work.</w:t>
+              <w:t>Unambiguous: the name contains a country, or an acronym that cannot plausibly mean anything else. A full-text match is accepted on its own – no country context and no field filter. Most genuine papers name their data source in the Methods section rather than the abstract, and OpenAlex indexes full text, so this is the tier that does most of the work.</w:t>
             </w:r>
             <w:r>
               <w:rPr>
@@ -887,7 +1251,7 @@
                 <w:sz w:val="18"/>
                 <w:szCs w:val="18"/>
               </w:rPr>
-              <w:t>A real survey name, but a generic one: the words describe the survey rather than identify it, and other countries or programmes use the same phrase. Requires an LSMS country word somewhere in the document AND an allowed subject field. Case-insensitive — casing carries no information in a phrase.</w:t>
+              <w:t>A real survey name, but a generic one: the words describe the survey rather than identify it, and other countries or programmes use the same phrase. Requires an LSMS country word somewhere in the document AND an allowed subject field. Case-insensitive – casing carries no information in a phrase.</w:t>
             </w:r>
           </w:p>
         </w:tc>
@@ -978,7 +1342,7 @@
         <w:spacing w:after="100"/>
       </w:pPr>
       <w:r>
-        <w:t>IDENTITY — is this really one of our surveys, or a name collision, or a different country's survey that happens to share a phrase?</w:t>
+        <w:t>IDENTITY – is this really one of our surveys, or a name collision, or a different country's survey that happens to share a phrase?</w:t>
       </w:r>
     </w:p>
     <w:p>
@@ -987,7 +1351,7 @@
         <w:spacing w:after="100"/>
       </w:pPr>
       <w:r>
-        <w:t>USE — did the authors actually work with the microdata, or do they only mention it: cite it, credit it, list it as related work?</w:t>
+        <w:t>USE – did the authors actually work with the microdata, or do they only mention it: cite it, credit it, list it as related work?</w:t>
       </w:r>
     </w:p>
     <w:p>
@@ -1016,8 +1380,20 @@
     </w:p>
     <w:tbl>
       <w:tblPr>
-        <w:tblW w:type="auto" w:w="0"/>
-        <w:tblLook w:firstColumn="1" w:firstRow="1" w:lastColumn="0" w:lastRow="0" w:noHBand="0" w:noVBand="1" w:val="04A0"/>
+        <w:tblW w:w="10075" w:type="dxa"/>
+        <w:tblBorders>
+          <w:top w:val="single" w:sz="4" w:space="0" w:color="auto"/>
+          <w:left w:val="single" w:sz="4" w:space="0" w:color="auto"/>
+          <w:bottom w:val="single" w:sz="4" w:space="0" w:color="auto"/>
+          <w:right w:val="single" w:sz="4" w:space="0" w:color="auto"/>
+          <w:insideH w:val="single" w:sz="4" w:space="0" w:color="auto"/>
+          <w:insideV w:val="single" w:sz="4" w:space="0" w:color="auto"/>
+        </w:tblBorders>
+        <w:tblCellMar>
+          <w:left w:w="10" w:type="dxa"/>
+          <w:right w:w="10" w:type="dxa"/>
+        </w:tblCellMar>
+        <w:tblLook w:val="0000" w:firstRow="0" w:lastRow="0" w:firstColumn="0" w:lastColumn="0" w:noHBand="0" w:noVBand="0"/>
       </w:tblPr>
       <w:tblGrid>
         <w:gridCol w:w="3480"/>
@@ -1027,12 +1403,17 @@
       <w:tr>
         <w:tc>
           <w:tcPr>
-            <w:tcW w:type="dxa" w:w="3480"/>
+            <w:tcW w:w="1400" w:type="dxa"/>
+            <w:shd w:val="clear" w:color="auto" w:fill="4C94D8" w:themeFill="text2" w:themeFillTint="80"/>
           </w:tcPr>
           <w:p>
             <w:r>
               <w:rPr>
                 <w:b/>
+                <w:bCs/>
+                <w:color w:val="FFFFFF"/>
+                <w:sz w:val="18"/>
+                <w:szCs w:val="18"/>
               </w:rPr>
               <w:t>Axis</w:t>
             </w:r>
@@ -1040,12 +1421,17 @@
         </w:tc>
         <w:tc>
           <w:tcPr>
-            <w:tcW w:type="dxa" w:w="3480"/>
+            <w:tcW w:w="7275" w:type="dxa"/>
+            <w:shd w:val="clear" w:color="auto" w:fill="4C94D8" w:themeFill="text2" w:themeFillTint="80"/>
           </w:tcPr>
           <w:p>
             <w:r>
               <w:rPr>
                 <w:b/>
+                <w:bCs/>
+                <w:color w:val="FFFFFF"/>
+                <w:sz w:val="18"/>
+                <w:szCs w:val="18"/>
               </w:rPr>
               <w:t>Signal</w:t>
             </w:r>
@@ -1053,12 +1439,17 @@
         </w:tc>
         <w:tc>
           <w:tcPr>
-            <w:tcW w:type="dxa" w:w="3480"/>
+            <w:tcW w:w="1400" w:type="dxa"/>
+            <w:shd w:val="clear" w:color="auto" w:fill="4C94D8" w:themeFill="text2" w:themeFillTint="80"/>
           </w:tcPr>
           <w:p>
             <w:r>
               <w:rPr>
                 <w:b/>
+                <w:bCs/>
+                <w:color w:val="FFFFFF"/>
+                <w:sz w:val="18"/>
+                <w:szCs w:val="18"/>
               </w:rPr>
               <w:t>Weight</w:t>
             </w:r>
@@ -1068,30 +1459,42 @@
       <w:tr>
         <w:tc>
           <w:tcPr>
-            <w:tcW w:type="dxa" w:w="3480"/>
-          </w:tcPr>
-          <w:p>
-            <w:r>
+            <w:tcW w:w="1400" w:type="dxa"/>
+          </w:tcPr>
+          <w:p>
+            <w:r>
+              <w:rPr>
+                <w:sz w:val="18"/>
+                <w:szCs w:val="18"/>
+              </w:rPr>
               <w:t>Identity</w:t>
             </w:r>
           </w:p>
         </w:tc>
         <w:tc>
           <w:tcPr>
-            <w:tcW w:type="dxa" w:w="3480"/>
-          </w:tcPr>
-          <w:p>
-            <w:r>
+            <w:tcW w:w="7275" w:type="dxa"/>
+          </w:tcPr>
+          <w:p>
+            <w:r>
+              <w:rPr>
+                <w:sz w:val="18"/>
+                <w:szCs w:val="18"/>
+              </w:rPr>
               <w:t>A known survey name appears in the title</w:t>
             </w:r>
           </w:p>
         </w:tc>
         <w:tc>
           <w:tcPr>
-            <w:tcW w:type="dxa" w:w="3480"/>
-          </w:tcPr>
-          <w:p>
-            <w:r>
+            <w:tcW w:w="1400" w:type="dxa"/>
+          </w:tcPr>
+          <w:p>
+            <w:r>
+              <w:rPr>
+                <w:sz w:val="18"/>
+                <w:szCs w:val="18"/>
+              </w:rPr>
               <w:t>Strong (2)</w:t>
             </w:r>
           </w:p>
@@ -1100,30 +1503,42 @@
       <w:tr>
         <w:tc>
           <w:tcPr>
-            <w:tcW w:type="dxa" w:w="3480"/>
-          </w:tcPr>
-          <w:p>
-            <w:r>
+            <w:tcW w:w="1400" w:type="dxa"/>
+          </w:tcPr>
+          <w:p>
+            <w:r>
+              <w:rPr>
+                <w:sz w:val="18"/>
+                <w:szCs w:val="18"/>
+              </w:rPr>
               <w:t>Identity</w:t>
             </w:r>
           </w:p>
         </w:tc>
         <w:tc>
           <w:tcPr>
-            <w:tcW w:type="dxa" w:w="3480"/>
-          </w:tcPr>
-          <w:p>
-            <w:r>
+            <w:tcW w:w="7275" w:type="dxa"/>
+          </w:tcPr>
+          <w:p>
+            <w:r>
+              <w:rPr>
+                <w:sz w:val="18"/>
+                <w:szCs w:val="18"/>
+              </w:rPr>
               <w:t>A known survey name appears in the abstract</w:t>
             </w:r>
           </w:p>
         </w:tc>
         <w:tc>
           <w:tcPr>
-            <w:tcW w:type="dxa" w:w="3480"/>
-          </w:tcPr>
-          <w:p>
-            <w:r>
+            <w:tcW w:w="1400" w:type="dxa"/>
+          </w:tcPr>
+          <w:p>
+            <w:r>
+              <w:rPr>
+                <w:sz w:val="18"/>
+                <w:szCs w:val="18"/>
+              </w:rPr>
               <w:t>Strong (2)</w:t>
             </w:r>
           </w:p>
@@ -1132,30 +1547,42 @@
       <w:tr>
         <w:tc>
           <w:tcPr>
-            <w:tcW w:type="dxa" w:w="3480"/>
-          </w:tcPr>
-          <w:p>
-            <w:r>
+            <w:tcW w:w="1400" w:type="dxa"/>
+          </w:tcPr>
+          <w:p>
+            <w:r>
+              <w:rPr>
+                <w:sz w:val="18"/>
+                <w:szCs w:val="18"/>
+              </w:rPr>
               <w:t>Identity</w:t>
             </w:r>
           </w:p>
         </w:tc>
         <w:tc>
           <w:tcPr>
-            <w:tcW w:type="dxa" w:w="3480"/>
-          </w:tcPr>
-          <w:p>
-            <w:r>
+            <w:tcW w:w="7275" w:type="dxa"/>
+          </w:tcPr>
+          <w:p>
+            <w:r>
+              <w:rPr>
+                <w:sz w:val="18"/>
+                <w:szCs w:val="18"/>
+              </w:rPr>
               <w:t>Admitted on a Tier A (unambiguous) name</w:t>
             </w:r>
           </w:p>
         </w:tc>
         <w:tc>
           <w:tcPr>
-            <w:tcW w:type="dxa" w:w="3480"/>
-          </w:tcPr>
-          <w:p>
-            <w:r>
+            <w:tcW w:w="1400" w:type="dxa"/>
+          </w:tcPr>
+          <w:p>
+            <w:r>
+              <w:rPr>
+                <w:sz w:val="18"/>
+                <w:szCs w:val="18"/>
+              </w:rPr>
               <w:t>Strong (2)</w:t>
             </w:r>
           </w:p>
@@ -1164,30 +1591,42 @@
       <w:tr>
         <w:tc>
           <w:tcPr>
-            <w:tcW w:type="dxa" w:w="3480"/>
-          </w:tcPr>
-          <w:p>
-            <w:r>
+            <w:tcW w:w="1400" w:type="dxa"/>
+          </w:tcPr>
+          <w:p>
+            <w:r>
+              <w:rPr>
+                <w:sz w:val="18"/>
+                <w:szCs w:val="18"/>
+              </w:rPr>
               <w:t>Identity</w:t>
             </w:r>
           </w:p>
         </w:tc>
         <w:tc>
           <w:tcPr>
-            <w:tcW w:type="dxa" w:w="3480"/>
-          </w:tcPr>
-          <w:p>
-            <w:r>
+            <w:tcW w:w="7275" w:type="dxa"/>
+          </w:tcPr>
+          <w:p>
+            <w:r>
+              <w:rPr>
+                <w:sz w:val="18"/>
+                <w:szCs w:val="18"/>
+              </w:rPr>
               <w:t>Admitted only on a Tier B/C (generic or acronym) term</w:t>
             </w:r>
           </w:p>
         </w:tc>
         <w:tc>
           <w:tcPr>
-            <w:tcW w:type="dxa" w:w="3480"/>
-          </w:tcPr>
-          <w:p>
-            <w:r>
+            <w:tcW w:w="1400" w:type="dxa"/>
+          </w:tcPr>
+          <w:p>
+            <w:r>
+              <w:rPr>
+                <w:sz w:val="18"/>
+                <w:szCs w:val="18"/>
+              </w:rPr>
               <w:t>Weak (1)</w:t>
             </w:r>
           </w:p>
@@ -1196,30 +1635,42 @@
       <w:tr>
         <w:tc>
           <w:tcPr>
-            <w:tcW w:type="dxa" w:w="3480"/>
-          </w:tcPr>
-          <w:p>
-            <w:r>
+            <w:tcW w:w="1400" w:type="dxa"/>
+          </w:tcPr>
+          <w:p>
+            <w:r>
+              <w:rPr>
+                <w:sz w:val="18"/>
+                <w:szCs w:val="18"/>
+              </w:rPr>
               <w:t>Identity</w:t>
             </w:r>
           </w:p>
         </w:tc>
         <w:tc>
           <w:tcPr>
-            <w:tcW w:type="dxa" w:w="3480"/>
-          </w:tcPr>
-          <w:p>
-            <w:r>
+            <w:tcW w:w="7275" w:type="dxa"/>
+          </w:tcPr>
+          <w:p>
+            <w:r>
+              <w:rPr>
+                <w:sz w:val="18"/>
+                <w:szCs w:val="18"/>
+              </w:rPr>
               <w:t>Matched terms from two or more survey families</w:t>
             </w:r>
           </w:p>
         </w:tc>
         <w:tc>
           <w:tcPr>
-            <w:tcW w:type="dxa" w:w="3480"/>
-          </w:tcPr>
-          <w:p>
-            <w:r>
+            <w:tcW w:w="1400" w:type="dxa"/>
+          </w:tcPr>
+          <w:p>
+            <w:r>
+              <w:rPr>
+                <w:sz w:val="18"/>
+                <w:szCs w:val="18"/>
+              </w:rPr>
               <w:t>Strong (2)</w:t>
             </w:r>
           </w:p>
@@ -1228,30 +1679,42 @@
       <w:tr>
         <w:tc>
           <w:tcPr>
-            <w:tcW w:type="dxa" w:w="3480"/>
-          </w:tcPr>
-          <w:p>
-            <w:r>
+            <w:tcW w:w="1400" w:type="dxa"/>
+          </w:tcPr>
+          <w:p>
+            <w:r>
+              <w:rPr>
+                <w:sz w:val="18"/>
+                <w:szCs w:val="18"/>
+              </w:rPr>
               <w:t>Identity</w:t>
             </w:r>
           </w:p>
         </w:tc>
         <w:tc>
           <w:tcPr>
-            <w:tcW w:type="dxa" w:w="3480"/>
-          </w:tcPr>
-          <w:p>
-            <w:r>
+            <w:tcW w:w="7275" w:type="dxa"/>
+          </w:tcPr>
+          <w:p>
+            <w:r>
+              <w:rPr>
+                <w:sz w:val="18"/>
+                <w:szCs w:val="18"/>
+              </w:rPr>
               <w:t>Matched two or more term variants of one survey</w:t>
             </w:r>
           </w:p>
         </w:tc>
         <w:tc>
           <w:tcPr>
-            <w:tcW w:type="dxa" w:w="3480"/>
-          </w:tcPr>
-          <w:p>
-            <w:r>
+            <w:tcW w:w="1400" w:type="dxa"/>
+          </w:tcPr>
+          <w:p>
+            <w:r>
+              <w:rPr>
+                <w:sz w:val="18"/>
+                <w:szCs w:val="18"/>
+              </w:rPr>
               <w:t>Weak (1)</w:t>
             </w:r>
           </w:p>
@@ -1260,30 +1723,42 @@
       <w:tr>
         <w:tc>
           <w:tcPr>
-            <w:tcW w:type="dxa" w:w="3480"/>
-          </w:tcPr>
-          <w:p>
-            <w:r>
+            <w:tcW w:w="1400" w:type="dxa"/>
+          </w:tcPr>
+          <w:p>
+            <w:r>
+              <w:rPr>
+                <w:sz w:val="18"/>
+                <w:szCs w:val="18"/>
+              </w:rPr>
               <w:t>Identity</w:t>
             </w:r>
           </w:p>
         </w:tc>
         <w:tc>
           <w:tcPr>
-            <w:tcW w:type="dxa" w:w="3480"/>
-          </w:tcPr>
-          <w:p>
-            <w:r>
+            <w:tcW w:w="7275" w:type="dxa"/>
+          </w:tcPr>
+          <w:p>
+            <w:r>
+              <w:rPr>
+                <w:sz w:val="18"/>
+                <w:szCs w:val="18"/>
+              </w:rPr>
               <w:t>An LSMS country is named in the title or abstract</w:t>
             </w:r>
           </w:p>
         </w:tc>
         <w:tc>
           <w:tcPr>
-            <w:tcW w:type="dxa" w:w="3480"/>
-          </w:tcPr>
-          <w:p>
-            <w:r>
+            <w:tcW w:w="1400" w:type="dxa"/>
+          </w:tcPr>
+          <w:p>
+            <w:r>
+              <w:rPr>
+                <w:sz w:val="18"/>
+                <w:szCs w:val="18"/>
+              </w:rPr>
               <w:t>Weak (1)</w:t>
             </w:r>
           </w:p>
@@ -1292,30 +1767,42 @@
       <w:tr>
         <w:tc>
           <w:tcPr>
-            <w:tcW w:type="dxa" w:w="3480"/>
-          </w:tcPr>
-          <w:p>
-            <w:r>
+            <w:tcW w:w="1400" w:type="dxa"/>
+          </w:tcPr>
+          <w:p>
+            <w:r>
+              <w:rPr>
+                <w:sz w:val="18"/>
+                <w:szCs w:val="18"/>
+              </w:rPr>
               <w:t>Identity</w:t>
             </w:r>
           </w:p>
         </w:tc>
         <w:tc>
           <w:tcPr>
-            <w:tcW w:type="dxa" w:w="3480"/>
-          </w:tcPr>
-          <w:p>
-            <w:r>
+            <w:tcW w:w="7275" w:type="dxa"/>
+          </w:tcPr>
+          <w:p>
+            <w:r>
+              <w:rPr>
+                <w:sz w:val="18"/>
+                <w:szCs w:val="18"/>
+              </w:rPr>
               <w:t>The LSMS programme is named in the abstract</w:t>
             </w:r>
           </w:p>
         </w:tc>
         <w:tc>
           <w:tcPr>
-            <w:tcW w:type="dxa" w:w="3480"/>
-          </w:tcPr>
-          <w:p>
-            <w:r>
+            <w:tcW w:w="1400" w:type="dxa"/>
+          </w:tcPr>
+          <w:p>
+            <w:r>
+              <w:rPr>
+                <w:sz w:val="18"/>
+                <w:szCs w:val="18"/>
+              </w:rPr>
               <w:t>Weak (1)</w:t>
             </w:r>
           </w:p>
@@ -1324,30 +1811,42 @@
       <w:tr>
         <w:tc>
           <w:tcPr>
-            <w:tcW w:type="dxa" w:w="3480"/>
-          </w:tcPr>
-          <w:p>
-            <w:r>
+            <w:tcW w:w="1400" w:type="dxa"/>
+          </w:tcPr>
+          <w:p>
+            <w:r>
+              <w:rPr>
+                <w:sz w:val="18"/>
+                <w:szCs w:val="18"/>
+              </w:rPr>
               <w:t>Identity</w:t>
             </w:r>
           </w:p>
         </w:tc>
         <w:tc>
           <w:tcPr>
-            <w:tcW w:type="dxa" w:w="3480"/>
-          </w:tcPr>
-          <w:p>
-            <w:r>
+            <w:tcW w:w="7275" w:type="dxa"/>
+          </w:tcPr>
+          <w:p>
+            <w:r>
+              <w:rPr>
+                <w:sz w:val="18"/>
+                <w:szCs w:val="18"/>
+              </w:rPr>
               <w:t>A World Bank–affiliated author</w:t>
             </w:r>
           </w:p>
         </w:tc>
         <w:tc>
           <w:tcPr>
-            <w:tcW w:type="dxa" w:w="3480"/>
-          </w:tcPr>
-          <w:p>
-            <w:r>
+            <w:tcW w:w="1400" w:type="dxa"/>
+          </w:tcPr>
+          <w:p>
+            <w:r>
+              <w:rPr>
+                <w:sz w:val="18"/>
+                <w:szCs w:val="18"/>
+              </w:rPr>
               <w:t>Weak (1)</w:t>
             </w:r>
           </w:p>
@@ -1356,30 +1855,42 @@
       <w:tr>
         <w:tc>
           <w:tcPr>
-            <w:tcW w:type="dxa" w:w="3480"/>
-          </w:tcPr>
-          <w:p>
-            <w:r>
+            <w:tcW w:w="1400" w:type="dxa"/>
+          </w:tcPr>
+          <w:p>
+            <w:r>
+              <w:rPr>
+                <w:sz w:val="18"/>
+                <w:szCs w:val="18"/>
+              </w:rPr>
               <w:t>Use</w:t>
             </w:r>
           </w:p>
         </w:tc>
         <w:tc>
           <w:tcPr>
-            <w:tcW w:type="dxa" w:w="3480"/>
-          </w:tcPr>
-          <w:p>
-            <w:r>
+            <w:tcW w:w="7275" w:type="dxa"/>
+          </w:tcPr>
+          <w:p>
+            <w:r>
+              <w:rPr>
+                <w:sz w:val="18"/>
+                <w:szCs w:val="18"/>
+              </w:rPr>
               <w:t>Abstract names the survey AND uses explicit first-person data-use language (“we use”, “using data from”, “microdata”)</w:t>
             </w:r>
           </w:p>
         </w:tc>
         <w:tc>
           <w:tcPr>
-            <w:tcW w:type="dxa" w:w="3480"/>
-          </w:tcPr>
-          <w:p>
-            <w:r>
+            <w:tcW w:w="1400" w:type="dxa"/>
+          </w:tcPr>
+          <w:p>
+            <w:r>
+              <w:rPr>
+                <w:sz w:val="18"/>
+                <w:szCs w:val="18"/>
+              </w:rPr>
               <w:t>Strong (2)</w:t>
             </w:r>
           </w:p>
@@ -1388,30 +1899,42 @@
       <w:tr>
         <w:tc>
           <w:tcPr>
-            <w:tcW w:type="dxa" w:w="3480"/>
-          </w:tcPr>
-          <w:p>
-            <w:r>
+            <w:tcW w:w="1400" w:type="dxa"/>
+          </w:tcPr>
+          <w:p>
+            <w:r>
+              <w:rPr>
+                <w:sz w:val="18"/>
+                <w:szCs w:val="18"/>
+              </w:rPr>
               <w:t>Use</w:t>
             </w:r>
           </w:p>
         </w:tc>
         <w:tc>
           <w:tcPr>
-            <w:tcW w:type="dxa" w:w="3480"/>
-          </w:tcPr>
-          <w:p>
-            <w:r>
+            <w:tcW w:w="7275" w:type="dxa"/>
+          </w:tcPr>
+          <w:p>
+            <w:r>
+              <w:rPr>
+                <w:sz w:val="18"/>
+                <w:szCs w:val="18"/>
+              </w:rPr>
               <w:t>Abstract names the survey AND uses weaker data-source language</w:t>
             </w:r>
           </w:p>
         </w:tc>
         <w:tc>
           <w:tcPr>
-            <w:tcW w:type="dxa" w:w="3480"/>
-          </w:tcPr>
-          <w:p>
-            <w:r>
+            <w:tcW w:w="1400" w:type="dxa"/>
+          </w:tcPr>
+          <w:p>
+            <w:r>
+              <w:rPr>
+                <w:sz w:val="18"/>
+                <w:szCs w:val="18"/>
+              </w:rPr>
               <w:t>Weak (1)</w:t>
             </w:r>
           </w:p>
@@ -1420,30 +1943,42 @@
       <w:tr>
         <w:tc>
           <w:tcPr>
-            <w:tcW w:type="dxa" w:w="3480"/>
-          </w:tcPr>
-          <w:p>
-            <w:r>
+            <w:tcW w:w="1400" w:type="dxa"/>
+          </w:tcPr>
+          <w:p>
+            <w:r>
+              <w:rPr>
+                <w:sz w:val="18"/>
+                <w:szCs w:val="18"/>
+              </w:rPr>
               <w:t>Use</w:t>
             </w:r>
           </w:p>
         </w:tc>
         <w:tc>
           <w:tcPr>
-            <w:tcW w:type="dxa" w:w="3480"/>
-          </w:tcPr>
-          <w:p>
-            <w:r>
+            <w:tcW w:w="7275" w:type="dxa"/>
+          </w:tcPr>
+          <w:p>
+            <w:r>
+              <w:rPr>
+                <w:sz w:val="18"/>
+                <w:szCs w:val="18"/>
+              </w:rPr>
               <w:t>Full text: first-person data-use language within 40 words of the survey name (also grants +1 identity)</w:t>
             </w:r>
           </w:p>
         </w:tc>
         <w:tc>
           <w:tcPr>
-            <w:tcW w:type="dxa" w:w="3480"/>
-          </w:tcPr>
-          <w:p>
-            <w:r>
+            <w:tcW w:w="1400" w:type="dxa"/>
+          </w:tcPr>
+          <w:p>
+            <w:r>
+              <w:rPr>
+                <w:sz w:val="18"/>
+                <w:szCs w:val="18"/>
+              </w:rPr>
               <w:t>Strong (2)</w:t>
             </w:r>
           </w:p>
@@ -1452,30 +1987,42 @@
       <w:tr>
         <w:tc>
           <w:tcPr>
-            <w:tcW w:type="dxa" w:w="3480"/>
-          </w:tcPr>
-          <w:p>
-            <w:r>
+            <w:tcW w:w="1400" w:type="dxa"/>
+          </w:tcPr>
+          <w:p>
+            <w:r>
+              <w:rPr>
+                <w:sz w:val="18"/>
+                <w:szCs w:val="18"/>
+              </w:rPr>
               <w:t>Use</w:t>
             </w:r>
           </w:p>
         </w:tc>
         <w:tc>
           <w:tcPr>
-            <w:tcW w:type="dxa" w:w="3480"/>
-          </w:tcPr>
-          <w:p>
-            <w:r>
+            <w:tcW w:w="7275" w:type="dxa"/>
+          </w:tcPr>
+          <w:p>
+            <w:r>
+              <w:rPr>
+                <w:sz w:val="18"/>
+                <w:szCs w:val="18"/>
+              </w:rPr>
               <w:t>Full text: data-object language near the survey name</w:t>
             </w:r>
           </w:p>
         </w:tc>
         <w:tc>
           <w:tcPr>
-            <w:tcW w:type="dxa" w:w="3480"/>
-          </w:tcPr>
-          <w:p>
-            <w:r>
+            <w:tcW w:w="1400" w:type="dxa"/>
+          </w:tcPr>
+          <w:p>
+            <w:r>
+              <w:rPr>
+                <w:sz w:val="18"/>
+                <w:szCs w:val="18"/>
+              </w:rPr>
               <w:t>Weak (1)</w:t>
             </w:r>
           </w:p>
@@ -1484,30 +2031,42 @@
       <w:tr>
         <w:tc>
           <w:tcPr>
-            <w:tcW w:type="dxa" w:w="3480"/>
-          </w:tcPr>
-          <w:p>
-            <w:r>
+            <w:tcW w:w="1400" w:type="dxa"/>
+          </w:tcPr>
+          <w:p>
+            <w:r>
+              <w:rPr>
+                <w:sz w:val="18"/>
+                <w:szCs w:val="18"/>
+              </w:rPr>
               <w:t>Use</w:t>
             </w:r>
           </w:p>
         </w:tc>
         <w:tc>
           <w:tcPr>
-            <w:tcW w:type="dxa" w:w="3480"/>
-          </w:tcPr>
-          <w:p>
-            <w:r>
+            <w:tcW w:w="7275" w:type="dxa"/>
+          </w:tcPr>
+          <w:p>
+            <w:r>
+              <w:rPr>
+                <w:sz w:val="18"/>
+                <w:szCs w:val="18"/>
+              </w:rPr>
               <w:t>Full text: who ran, funded or implemented the survey, near its name</w:t>
             </w:r>
           </w:p>
         </w:tc>
         <w:tc>
           <w:tcPr>
-            <w:tcW w:type="dxa" w:w="3480"/>
-          </w:tcPr>
-          <w:p>
-            <w:r>
+            <w:tcW w:w="1400" w:type="dxa"/>
+          </w:tcPr>
+          <w:p>
+            <w:r>
+              <w:rPr>
+                <w:sz w:val="18"/>
+                <w:szCs w:val="18"/>
+              </w:rPr>
               <w:t>Weak (1)</w:t>
             </w:r>
           </w:p>
@@ -1516,30 +2075,42 @@
       <w:tr>
         <w:tc>
           <w:tcPr>
-            <w:tcW w:type="dxa" w:w="3480"/>
-          </w:tcPr>
-          <w:p>
-            <w:r>
+            <w:tcW w:w="1400" w:type="dxa"/>
+          </w:tcPr>
+          <w:p>
+            <w:r>
+              <w:rPr>
+                <w:sz w:val="18"/>
+                <w:szCs w:val="18"/>
+              </w:rPr>
               <w:t>Use</w:t>
             </w:r>
           </w:p>
         </w:tc>
         <w:tc>
           <w:tcPr>
-            <w:tcW w:type="dxa" w:w="3480"/>
-          </w:tcPr>
-          <w:p>
-            <w:r>
+            <w:tcW w:w="7275" w:type="dxa"/>
+          </w:tcPr>
+          <w:p>
+            <w:r>
+              <w:rPr>
+                <w:sz w:val="18"/>
+                <w:szCs w:val="18"/>
+              </w:rPr>
               <w:t>Untied evidence: empirical vocabulary, or data-use language with no survey named</w:t>
             </w:r>
           </w:p>
         </w:tc>
         <w:tc>
           <w:tcPr>
-            <w:tcW w:type="dxa" w:w="3480"/>
-          </w:tcPr>
-          <w:p>
-            <w:r>
+            <w:tcW w:w="1400" w:type="dxa"/>
+          </w:tcPr>
+          <w:p>
+            <w:r>
+              <w:rPr>
+                <w:sz w:val="18"/>
+                <w:szCs w:val="18"/>
+              </w:rPr>
               <w:t>Capped at 1 total</w:t>
             </w:r>
           </w:p>
@@ -1551,7 +2122,7 @@
         <w:spacing w:after="100"/>
       </w:pPr>
       <w:r>
-        <w:t>TIED versus UNTIED use evidence. This is the subtlety that makes the use axis mean anything. An abstract saying “we use household survey data” proves the authors used some data — not that they used ours. Only evidence that ties the use language to the survey itself counts in full: either the full-text pass finds the two within 40 words of each other, or the abstract both names the survey and describes using data. Generic evidence that is not tied to any particular survey (empirical vocabulary such as “regression” or “household”, or data-use language with no survey named) is capped at 1 point in total, so it can corroborate a real signal but can never carry the axis by itself.</w:t>
+        <w:t>TIED versus UNTIED use evidence. This is the subtlety that makes the use axis mean anything. An abstract saying “we use household survey data” proves the authors used some data – not that they used ours. Only evidence that ties the use language to the survey itself counts in full: either the full-text pass finds the two within 40 words of each other, or the abstract both names the survey and describes using data. Generic evidence that is not tied to any particular survey (empirical vocabulary such as “regression” or “household”, or data-use language with no survey named) is capped at 1 point in total, so it can corroborate a real signal but can never carry the axis by itself.</w:t>
       </w:r>
     </w:p>
     <w:p>
@@ -1559,7 +2130,7 @@
         <w:spacing w:after="100"/>
       </w:pPr>
       <w:r>
-        <w:t>The full-text pass (Gate 2b) is a second, separate step that runs only for papers whose USE score is still short — note, the use axis specifically, not the total. A paper can sit on a mountain of identity evidence and still show nothing about whether the data was used, and that is precisely the paper worth spending an API call on. It asks OpenAlex whether the paper's own matched survey name sits within 40 words of language describing working with the data.</w:t>
+        <w:t>The full-text pass (Gate 2b) is a second, separate step that runs only for papers whose USE score is still short – note, the use axis specifically, not the total. A paper can sit on a mountain of identity evidence and still show nothing about whether the data was used, and that is precisely the paper worth spending an API call on. It asks OpenAlex whether the paper's own matched survey name sits within 40 words of language describing working with the data.</w:t>
       </w:r>
     </w:p>
     <w:p>
@@ -1567,7 +2138,7 @@
         <w:spacing w:after="100"/>
       </w:pPr>
       <w:r>
-        <w:t>The phrases it looks for were chosen by measurement, not intuition: every candidate was run against a 36-paper review set and scored on how many genuine users versus non-users it caught. “Using data from” separates cleanly (8 real users against 1 non-user); “this paper uses” and “based on the” turned out to be negative indicators, hitting more citations than real uses, and were removed. Citing the World Bank microdata catalogue scored 2 against 2 — no separating power at all — so it is searched and reported as a flag on the paper, but earns no points.</w:t>
+        <w:t>The phrases it looks for were chosen by measurement, not intuition: every candidate was run against a 36-paper review set and scored on how many genuine users versus non-users it caught. “Using data from” separates cleanly (8 real users against 1 non-user); “this paper uses” and “based on the” turned out to be negative indicators, hitting more citations than real uses, and were removed. Citing the World Bank microdata catalogue scored 2 against 2 – no separating power at all – so it is searched and reported as a flag on the paper, but earns no points.</w:t>
       </w:r>
     </w:p>
     <w:p>
@@ -1575,7 +2146,7 @@
         <w:spacing w:after="100"/>
       </w:pPr>
       <w:r>
-        <w:t>Two rules sit outside the points. First, six publication types can never be an empirical use of survey data and are excluded outright: conference abstract, dataset, paratext, erratum, letter and software. (Editorials are deliberately not on that list.) Second, papers written as literature reviews are flagged and held to a higher bar — a review that genuinely re-analyses the microdata still passes, but it must show a strong tied use signal rather than accumulating weak ones, because reviews are the single largest category of papers that mention a survey without using it.</w:t>
+        <w:t>Two rules sit outside the points. First, six publication types can never be an empirical use of survey data and are excluded outright: conference abstract, dataset, paratext, erratum, letter and software. (Editorials are deliberately not on that list.) Second, papers written as literature reviews are flagged and held to a higher bar – a review that genuinely re-analyses the microdata still passes, but it must show a strong tied use signal rather than accumulating weak ones, because reviews are the single largest category of papers that mention a survey without using it.</w:t>
       </w:r>
     </w:p>
     <w:p>
@@ -2043,6 +2614,100 @@
           <w:szCs w:val="32"/>
         </w:rPr>
       </w:pPr>
+    </w:p>
+    <w:p>
+      <w:pPr>
+        <w:pStyle w:val="Heading2"/>
+        <w:rPr>
+          <w:color w:val="2E74B5"/>
+          <w:sz w:val="32"/>
+          <w:szCs w:val="32"/>
+        </w:rPr>
+      </w:pPr>
+      <w:r>
+        <w:rPr>
+          <w:b w:val="0"/>
+        </w:rPr>
+        <w:t>2.8 Known limits</w:t>
+      </w:r>
+    </w:p>
+    <w:p>
+      <w:pPr>
+        <w:rPr>
+          <w:color w:val="2E74B5"/>
+          <w:sz w:val="32"/>
+          <w:szCs w:val="32"/>
+        </w:rPr>
+      </w:pPr>
+      <w:r>
+        <w:rPr>
+          <w:b w:val="0"/>
+        </w:rPr>
+        <w:t>Two categories of error remain, and both follow from the same constraint: OpenAlex exposes a search index over full text, not the text itself, so the pipeline can ask whether two phrases occur near each other but cannot see which section they occur in.</w:t>
+      </w:r>
+    </w:p>
+    <w:p>
+      <w:pPr>
+        <w:rPr>
+          <w:color w:val="2E74B5"/>
+          <w:sz w:val="32"/>
+          <w:szCs w:val="32"/>
+        </w:rPr>
+      </w:pPr>
+      <w:r>
+        <w:rPr>
+          <w:b/>
+        </w:rPr>
+        <w:t>Reference-only matches.</w:t>
+      </w:r>
+      <w:r>
+        <w:rPr>
+          <w:b w:val="0"/>
+        </w:rPr>
+        <w:t xml:space="preserve"> A paper that cites a survey without using it still contains the survey name, and a dataset citation carries collection language of its own, for example “Uganda National Panel Survey 2019-2020, collected by Uganda Bureau of Statistics”. Proximity cannot separate that from a methods sentence, because both appear in the same document. Four papers in the review set pass this way.</w:t>
+      </w:r>
+    </w:p>
+    <w:p>
+      <w:pPr>
+        <w:rPr>
+          <w:color w:val="2E74B5"/>
+          <w:sz w:val="32"/>
+          <w:szCs w:val="32"/>
+        </w:rPr>
+      </w:pPr>
+      <w:r>
+        <w:rPr>
+          <w:b/>
+        </w:rPr>
+        <w:t>Unindexed data statements.</w:t>
+      </w:r>
+      <w:r>
+        <w:rPr>
+          <w:b w:val="0"/>
+        </w:rPr>
+        <w:t xml:space="preserve"> Some papers declare their data in a table or a dataset section that OpenAlex has not indexed. In one verified case the phrase “Living Standards Measurement Study” appears in the paper's own dataset section yet is absent from the index at every query length and proximity setting, while the acronym alone is present. No query formulation reaches that paper.</w:t>
+      </w:r>
+    </w:p>
+    <w:p>
+      <w:pPr>
+        <w:rPr>
+          <w:color w:val="2E74B5"/>
+          <w:sz w:val="32"/>
+          <w:szCs w:val="32"/>
+        </w:rPr>
+      </w:pPr>
+      <w:r>
+        <w:rPr>
+          <w:b w:val="0"/>
+        </w:rPr>
+        <w:t xml:space="preserve">Section-aware analysis would address both, and was tested. Europe PMC returns sectioned full text and separates use from mention correctly where it has coverage, but it indexes none of the economics venues this corpus depends on, covering 4 of 10 sample papers and misclassifying one genuine user. </w:t>
+      </w:r>
+      <w:r>
+        <w:rPr>
+          <w:b/>
+        </w:rPr>
+        <w:t>Closing these gaps requires a full-text source with reliable coverage of development and agricultural economics, not further tuning of the current signals.</w:t>
+      </w:r>
     </w:p>
     <w:p>
       <w:pPr>

</xml_diff>

<commit_message>
Rewrite section 2 so it can be read cold
The section used "Gate 1" and "Gate 2" as if the reader already knew a
two-gate design existed, when the document never introduced one. First
mention of Gate 1 was mid-sentence in a paragraph about stemming; Gate 2 was
a heading. "Gate 2b", "axes" and "tied versus untied" stacked on top of that.

Adds 2.1 How the pipeline works, which states the two steps in plain terms
before anything depends on them and notes that the code calls them Gate 1 and
Gate 2. Retitles every subsection as a plain statement of what it covers
rather than a question or an internal term, and renames the two scores to the
questions they answer.

Also fixes the ordering: the keyword section ended "each keyword carries one
of three tiers:" and the whole stemming section then intervened before the
table that colon promised. Stemming now follows the tier table.
</commit_message>
<xml_diff>
--- a/LSMS_Impact_Analysis_Pipeline_Documentation.docx
+++ b/LSMS_Impact_Analysis_Pipeline_Documentation.docx
@@ -70,10 +70,23 @@
         </w:rPr>
       </w:pPr>
       <w:r>
-        <w:rPr>
-          <w:b w:val="0"/>
-        </w:rPr>
-        <w:t xml:space="preserve">The pipeline answers one question at scale: which published research actually uses LSMS data? It searches OpenAlex, the largest open index of scholarly work, for 109 survey keywords across 10 survey families, and then decides, paper by paper, whether the match reflects genuine use of the data or only a passing mention. </w:t>
+        <w:t xml:space="preserve">The pipeline answers one question </w:t>
+      </w:r>
+      <w:proofErr w:type="gramStart"/>
+      <w:r>
+        <w:t>at</w:t>
+      </w:r>
+      <w:proofErr w:type="gramEnd"/>
+      <w:r>
+        <w:t xml:space="preserve"> scale: which published research </w:t>
+      </w:r>
+      <w:proofErr w:type="gramStart"/>
+      <w:r>
+        <w:t>actually uses</w:t>
+      </w:r>
+      <w:proofErr w:type="gramEnd"/>
+      <w:r>
+        <w:t xml:space="preserve"> LSMS data? It searches OpenAlex, the largest open index of scholarly work, for 109 survey keywords across 10 survey families, and then decides, paper by paper, whether the match reflects genuine use of the data or only a passing mention. </w:t>
       </w:r>
       <w:r>
         <w:rPr>
@@ -94,9 +107,6 @@
         </w:rPr>
       </w:pPr>
       <w:r>
-        <w:rPr>
-          <w:b w:val="0"/>
-        </w:rPr>
         <w:t xml:space="preserve">Earlier versions collapsed them into a single relevance score, which let a paper pass on name recognition alone. A literature review naming the survey three times, written by a World Bank author, outscored a real empirical study. The current version scores an </w:t>
       </w:r>
       <w:r>
@@ -106,9 +116,6 @@
         <w:t>identity</w:t>
       </w:r>
       <w:r>
-        <w:rPr>
-          <w:b w:val="0"/>
-        </w:rPr>
         <w:t xml:space="preserve"> axis (is this genuinely one of our surveys?) and a </w:t>
       </w:r>
       <w:r>
@@ -118,9 +125,6 @@
         <w:t>use</w:t>
       </w:r>
       <w:r>
-        <w:rPr>
-          <w:b w:val="0"/>
-        </w:rPr>
         <w:t xml:space="preserve"> axis (did the authors work with the microdata?) independently, and a paper reaches the results only if it clears both. This makes “mentions the survey but never uses the data” structurally unable to pass, which is what the previous design could not guarantee.</w:t>
       </w:r>
     </w:p>
@@ -136,9 +140,6 @@
         </w:rPr>
       </w:pPr>
       <w:r>
-        <w:rPr>
-          <w:b w:val="0"/>
-        </w:rPr>
         <w:t xml:space="preserve">Two further decisions matter for accuracy. Searches run unstemmed, because OpenAlex by default treats LSMS and LSM as the same word and returns the entire land-surface model literature: 13,506 results for a single fiscal year against 698 unstemmed. And the phrase lists that detect data use were selected by measurement against a 36-paper review set rather than by intuition, which removed three phrases that turned out to indicate citation rather than use. </w:t>
       </w:r>
       <w:r>
@@ -160,10 +161,7 @@
         </w:rPr>
       </w:pPr>
       <w:r>
-        <w:rPr>
-          <w:b w:val="0"/>
-        </w:rPr>
-        <w:t>The remaining disagreements are understood rather than mysterious. They divide into papers whose survey name appears only in the reference list, and papers whose data use is declared in a table or dataset section that OpenAlex does not index. Both limits are set out in section 2.8.</w:t>
+        <w:t>The remaining disagreements are understood rather than mysterious. They divide into papers whose survey name appears only in the reference list, and papers whose data use is declared in a table or dataset section that OpenAlex does not index. Both limits are set out in section 2.10.</w:t>
       </w:r>
     </w:p>
     <w:tbl>
@@ -184,8 +182,8 @@
         <w:tblLook w:val="0000" w:firstRow="0" w:lastRow="0" w:firstColumn="0" w:lastColumn="0" w:noHBand="0" w:noVBand="0"/>
       </w:tblPr>
       <w:tblGrid>
-        <w:gridCol w:w="5220"/>
-        <w:gridCol w:w="5220"/>
+        <w:gridCol w:w="2400"/>
+        <w:gridCol w:w="7675"/>
       </w:tblGrid>
       <w:tr>
         <w:tc>
@@ -194,6 +192,7 @@
             <w:shd w:val="clear" w:color="auto" w:fill="4C94D8" w:themeFill="text2" w:themeFillTint="80"/>
           </w:tcPr>
           <w:p>
+            <w:proofErr w:type="gramStart"/>
             <w:r>
               <w:rPr>
                 <w:b/>
@@ -204,6 +203,7 @@
               </w:rPr>
               <w:t>At a glance</w:t>
             </w:r>
+            <w:proofErr w:type="gramEnd"/>
           </w:p>
         </w:tc>
         <w:tc>
@@ -429,19 +429,33 @@
         <w:rPr>
           <w:color w:val="000000" w:themeColor="text1"/>
         </w:rPr>
-        <w:t>This pipeline is a fully automated Python program. It finds every research paper that uses an LSMS-produced dataset, checks</w:t>
-      </w:r>
+        <w:t xml:space="preserve">This pipeline is a fully automated Python program. It finds every research paper that uses an LSMS-produced dataset, </w:t>
+      </w:r>
+      <w:proofErr w:type="gramStart"/>
       <w:r>
         <w:rPr>
           <w:color w:val="000000" w:themeColor="text1"/>
         </w:rPr>
+        <w:t>checks</w:t>
+      </w:r>
+      <w:r>
+        <w:rPr>
+          <w:color w:val="000000" w:themeColor="text1"/>
+        </w:rPr>
         <w:t xml:space="preserve">  </w:t>
       </w:r>
       <w:r>
         <w:rPr>
           <w:color w:val="000000" w:themeColor="text1"/>
         </w:rPr>
-        <w:t>how strong the evidence is for each match, and exports a structured Excel workbook. The entire process, including discovery, validation, and export, takes about five minutes with no manual work required.</w:t>
+        <w:t>how</w:t>
+      </w:r>
+      <w:proofErr w:type="gramEnd"/>
+      <w:r>
+        <w:rPr>
+          <w:color w:val="000000" w:themeColor="text1"/>
+        </w:rPr>
+        <w:t xml:space="preserve"> strong the evidence is for each match, and exports a structured Excel workbook. The entire process, including discovery, validation, and export, takes about five minutes with no manual work required.</w:t>
       </w:r>
       <w:r>
         <w:rPr>
@@ -763,6 +777,7 @@
         <w:spacing w:after="100"/>
       </w:pPr>
       <w:r>
+        <w:lastRenderedPageBreak/>
         <w:t>A confidence breakdown showing how each paper was matched, and its identity and use scores.</w:t>
       </w:r>
     </w:p>
@@ -929,40 +944,69 @@
     <w:p>
       <w:pPr>
         <w:pStyle w:val="Heading2"/>
-        <w:spacing w:before="180" w:after="80"/>
-      </w:pPr>
-      <w:r>
-        <w:t>2.1 Data source</w:t>
-      </w:r>
-    </w:p>
-    <w:p>
-      <w:pPr>
-        <w:spacing w:after="100"/>
-      </w:pPr>
-      <w:r>
-        <w:t xml:space="preserve">The pipeline searches </w:t>
-      </w:r>
-      <w:proofErr w:type="spellStart"/>
-      <w:r>
-        <w:t>OpenAlex</w:t>
-      </w:r>
-      <w:proofErr w:type="spellEnd"/>
-      <w:r>
-        <w:t>, a free, comprehensive scholarly index</w:t>
-      </w:r>
-      <w:r>
-        <w:t xml:space="preserve"> </w:t>
-      </w:r>
-      <w:r>
-        <w:t>that covers journal articles, working papers, preprints, and grey literature (</w:t>
-      </w:r>
-      <w:proofErr w:type="spellStart"/>
-      <w:r>
-        <w:t>arXiv</w:t>
-      </w:r>
-      <w:proofErr w:type="spellEnd"/>
-      <w:r>
-        <w:t xml:space="preserve">, SSRN, NBER, and similar repositories). </w:t>
+        <w:spacing w:before="280" w:after="110"/>
+      </w:pPr>
+      <w:r>
+        <w:rPr>
+          <w:b w:val="0"/>
+        </w:rPr>
+        <w:t>2.1 How the pipeline works</w:t>
+      </w:r>
+    </w:p>
+    <w:p>
+      <w:pPr>
+        <w:spacing w:before="280" w:after="110"/>
+      </w:pPr>
+      <w:r>
+        <w:rPr>
+          <w:b w:val="0"/>
+        </w:rPr>
+        <w:t>The pipeline runs in two steps. Everything else in this section belongs to one or the other, so it is worth separating them clearly before going further.</w:t>
+      </w:r>
+    </w:p>
+    <w:p>
+      <w:pPr>
+        <w:spacing w:before="280" w:after="110"/>
+      </w:pPr>
+      <w:r>
+        <w:rPr>
+          <w:b w:val="0"/>
+        </w:rPr>
+        <w:t>Step one searches for the survey names and collects every paper that mentions one. It is deliberately generous. Missing a paper here is permanent, whereas collecting one that turns out to be irrelevant costs nothing but a later rejection.</w:t>
+      </w:r>
+    </w:p>
+    <w:p>
+      <w:pPr>
+        <w:spacing w:before="280" w:after="110"/>
+      </w:pPr>
+      <w:r>
+        <w:rPr>
+          <w:b w:val="0"/>
+        </w:rPr>
+        <w:t xml:space="preserve">Step two examines each collected paper and decides whether it actually used the survey data. This is where most of the work happens, because </w:t>
+      </w:r>
+      <w:r>
+        <w:rPr>
+          <w:b/>
+        </w:rPr>
+        <w:t>most papers that mention a survey never use it</w:t>
+      </w:r>
+      <w:r>
+        <w:rPr>
+          <w:b w:val="0"/>
+        </w:rPr>
+        <w:t>. They cite it, credit it, or list it as related work.</w:t>
+      </w:r>
+    </w:p>
+    <w:p>
+      <w:pPr>
+        <w:spacing w:before="280" w:after="110"/>
+      </w:pPr>
+      <w:r>
+        <w:rPr>
+          <w:b w:val="0"/>
+        </w:rPr>
+        <w:t>In the code and in the output columns these two steps are called Gate 1 and Gate 2.</w:t>
       </w:r>
     </w:p>
     <w:p>
@@ -971,7 +1015,7 @@
         <w:spacing w:before="180" w:after="80"/>
       </w:pPr>
       <w:r>
-        <w:t>2.2 The keyword list and the three-tier matching system</w:t>
+        <w:t>2.2 Where the papers come from</w:t>
       </w:r>
     </w:p>
     <w:p>
@@ -979,7 +1023,38 @@
         <w:spacing w:after="100"/>
       </w:pPr>
       <w:r>
-        <w:t>Every search term comes from the keyword list the LSMS team already used in its Google Alerts tracker (the “Keywords ISA” and “Keywords HFPS” tabs), 109 terms in total, organised into 10 survey families. A handful of entries were recategorised or dropped as duplicates during the rework – for example “The Uganda National Panel survey” could never match anything the shorter “Uganda National Panel Survey” did not already catch.</w:t>
+        <w:t xml:space="preserve">The pipeline searches </w:t>
+      </w:r>
+      <w:proofErr w:type="spellStart"/>
+      <w:r>
+        <w:t>OpenAlex</w:t>
+      </w:r>
+      <w:proofErr w:type="spellEnd"/>
+      <w:r>
+        <w:t>, a free, comprehensive scholarly index</w:t>
+      </w:r>
+      <w:r>
+        <w:t xml:space="preserve"> </w:t>
+      </w:r>
+      <w:r>
+        <w:t>that covers journal articles, working papers, preprints, and grey literature (</w:t>
+      </w:r>
+      <w:proofErr w:type="spellStart"/>
+      <w:r>
+        <w:t>arXiv</w:t>
+      </w:r>
+      <w:proofErr w:type="spellEnd"/>
+      <w:r>
+        <w:t xml:space="preserve">, SSRN, NBER, and similar repositories). </w:t>
+      </w:r>
+    </w:p>
+    <w:p>
+      <w:pPr>
+        <w:pStyle w:val="Heading2"/>
+        <w:spacing w:before="180" w:after="80"/>
+      </w:pPr>
+      <w:r>
+        <w:t>2.3 Step one: searching for survey names</w:t>
       </w:r>
     </w:p>
     <w:p>
@@ -987,24 +1062,33 @@
         <w:spacing w:after="100"/>
       </w:pPr>
       <w:r>
-        <w:t>These keywords vary enormously in how ambiguous they are on their own. A phrase like “Uganda National Panel Survey” cannot reasonably appear outside LSMS-related work. A bare acronym like “IHS” appears in thousands of unrelated papers (health plans, hospital systems, and so on). And some names are real survey titles whose words merely describe the survey rather than identify it – “National Panel Survey” is both Tanzania's and Uganda's, and every agency ran a “High-Frequency Phone Survey” during COVID. Applying one rule to all three either throws away real papers or lets irrelevant ones in, so every keyword carries one of three tiers:</w:t>
-      </w:r>
-    </w:p>
-    <w:p>
-      <w:pPr>
-        <w:pStyle w:val="Heading2"/>
+        <w:rPr>
+          <w:b w:val="0"/>
+        </w:rPr>
+        <w:t>The search terms are the keyword list the LSMS team already used in its Google Alerts tracker, 109 terms across 10 survey families. A few entries were merged or dropped as duplicates, for example “The Uganda National Panel survey”, which could never match anything that the shorter “Uganda National Panel Survey” did not already catch.</w:t>
+      </w:r>
+    </w:p>
+    <w:p>
+      <w:pPr>
         <w:spacing w:after="100"/>
       </w:pPr>
       <w:r>
-        <w:t>2.3 Why searches are run unstemmed</w:t>
-      </w:r>
-    </w:p>
-    <w:p>
-      <w:pPr>
-        <w:spacing w:after="100"/>
-      </w:pPr>
-      <w:r>
-        <w:t>OpenAlex stems words by default, meaning a search for LSMS also matches LSM – the standard abbreviation for land-surface model and log-structured merge-tree. Stemmed, the bare “LSMS” query returned 13,506 hits for a single fiscal year; unstemmed it returns 698. Every Gate 1 query therefore goes out through OpenAlex's search.exact parameter, which bypasses stemming. Two caveats: search.exact is still case-insensitive (which is what the Tier C case check above is for), and a small NOT clause additionally excludes the known land-surface vocabulary from the bare LSMS query.</w:t>
+        <w:rPr>
+          <w:b w:val="0"/>
+        </w:rPr>
+        <w:t xml:space="preserve">These names differ enormously in how ambiguous they are. “Uganda National Panel Survey” cannot plausibly appear outside LSMS-related work. The acronym “IHS” appears in thousands of unrelated papers about health plans and hospital systems. And some are real survey titles whose words describe the survey rather than identify it: “National Panel Survey” belongs to both Tanzania and Uganda, and almost every agency ran a “High-Frequency Phone Survey” during COVID. One rule for all three would either discard real papers or admit irrelevant ones, so </w:t>
+      </w:r>
+      <w:r>
+        <w:rPr>
+          <w:b/>
+        </w:rPr>
+        <w:t>each keyword carries one of three tiers</w:t>
+      </w:r>
+      <w:r>
+        <w:rPr>
+          <w:b w:val="0"/>
+        </w:rPr>
+        <w:t>:</w:t>
       </w:r>
     </w:p>
     <w:tbl>
@@ -1163,34 +1247,6 @@
               </w:rPr>
               <w:t>Unambiguous: the name contains a country, or an acronym that cannot plausibly mean anything else. A full-text match is accepted on its own – no country context and no field filter. Most genuine papers name their data source in the Methods section rather than the abstract, and OpenAlex indexes full text, so this is the tier that does most of the work.</w:t>
             </w:r>
-            <w:r>
-              <w:rPr>
-                <w:color w:val="000000"/>
-                <w:sz w:val="18"/>
-                <w:szCs w:val="18"/>
-              </w:rPr>
-            </w:r>
-            <w:r>
-              <w:rPr>
-                <w:color w:val="000000"/>
-                <w:sz w:val="18"/>
-                <w:szCs w:val="18"/>
-              </w:rPr>
-            </w:r>
-            <w:r>
-              <w:rPr>
-                <w:color w:val="000000"/>
-                <w:sz w:val="18"/>
-                <w:szCs w:val="18"/>
-              </w:rPr>
-            </w:r>
-            <w:r>
-              <w:rPr>
-                <w:color w:val="000000"/>
-                <w:sz w:val="18"/>
-                <w:szCs w:val="18"/>
-              </w:rPr>
-            </w:r>
           </w:p>
         </w:tc>
       </w:tr>
@@ -1322,18 +1378,61 @@
     <w:p>
       <w:pPr>
         <w:pStyle w:val="Heading2"/>
+        <w:spacing w:after="100"/>
+      </w:pPr>
+      <w:r>
+        <w:t>2.4 Keeping the search precise</w:t>
+      </w:r>
+    </w:p>
+    <w:p>
+      <w:pPr>
+        <w:spacing w:after="100"/>
+      </w:pPr>
+      <w:proofErr w:type="gramStart"/>
+      <w:proofErr w:type="gramEnd"/>
+      <w:proofErr w:type="gramStart"/>
+      <w:proofErr w:type="gramEnd"/>
+      <w:r>
+        <w:rPr>
+          <w:b w:val="0"/>
+        </w:rPr>
+        <w:t xml:space="preserve">Search engines normally treat related words as equivalent, so a search for LSMS also returns LSM, the standard abbreviation for land-surface model. That single behaviour returned </w:t>
+      </w:r>
+      <w:r>
+        <w:rPr>
+          <w:b/>
+        </w:rPr>
+        <w:t>13,506 results for one fiscal year where the correct number was 698</w:t>
+      </w:r>
+      <w:r>
+        <w:rPr>
+          <w:b w:val="0"/>
+        </w:rPr>
+        <w:t>. Searches therefore run in exact mode, which switches that off. Exact mode still ignores capitalisation, so “LSMs” and “LSMS” remain identical to the search engine, which is what the Tier C case check in the table above is for.</w:t>
+      </w:r>
+    </w:p>
+    <w:p>
+      <w:pPr>
+        <w:pStyle w:val="Heading2"/>
         <w:spacing w:before="180" w:after="80"/>
       </w:pPr>
       <w:r>
-        <w:t>2.4 Gate 2: is it our survey, and did they actually use it?</w:t>
-      </w:r>
+        <w:t>2.5 Step two: separating genuine use from a passing mention</w:t>
+      </w:r>
+      <w:proofErr w:type="gramStart"/>
+      <w:r/>
+      <w:proofErr w:type="gramEnd"/>
+      <w:r/>
     </w:p>
     <w:p>
       <w:pPr>
         <w:spacing w:after="100"/>
       </w:pPr>
       <w:r>
-        <w:t>Matching a keyword is necessary but not sufficient. Gate 2 asks two separate questions about every admitted paper, and scores them on two independent axes:</w:t>
+        <w:rPr>
+          <w:b w:val="0"/>
+        </w:rPr>
+        <w:t>Finding a survey name proves only that the words appear somewhere in the paper. Step two therefore asks two different questions about every collected paper and scores them separately:</w:t>
       </w:r>
     </w:p>
     <w:p>
@@ -1342,7 +1441,28 @@
         <w:spacing w:after="100"/>
       </w:pPr>
       <w:r>
-        <w:t>IDENTITY – is this really one of our surveys, or a name collision, or a different country's survey that happens to share a phrase?</w:t>
+        <w:rPr>
+          <w:b/>
+        </w:rPr>
+        <w:t>Is this really one of our surveys?</w:t>
+      </w:r>
+      <w:r>
+        <w:rPr>
+          <w:b w:val="0"/>
+        </w:rPr>
+        <w:t xml:space="preserve"> A name can collide with an unrelated acronym, or belong to another country's survey that happens to share a phrase. This score is called </w:t>
+      </w:r>
+      <w:r>
+        <w:rPr>
+          <w:b/>
+        </w:rPr>
+        <w:t>identity</w:t>
+      </w:r>
+      <w:r>
+        <w:rPr>
+          <w:b w:val="0"/>
+        </w:rPr>
+        <w:t>.</w:t>
       </w:r>
     </w:p>
     <w:p>
@@ -1350,8 +1470,31 @@
         <w:pStyle w:val="ListParagraph"/>
         <w:spacing w:after="100"/>
       </w:pPr>
-      <w:r>
-        <w:t>USE – did the authors actually work with the microdata, or do they only mention it: cite it, credit it, list it as related work?</w:t>
+      <w:proofErr w:type="gramStart"/>
+      <w:proofErr w:type="gramEnd"/>
+      <w:r>
+        <w:rPr>
+          <w:b/>
+        </w:rPr>
+        <w:t>Did the authors actually work with the data?</w:t>
+      </w:r>
+      <w:r>
+        <w:rPr>
+          <w:b w:val="0"/>
+        </w:rPr>
+        <w:t xml:space="preserve"> Or do they only mention it in passing. This score is called </w:t>
+      </w:r>
+      <w:r>
+        <w:rPr>
+          <w:b/>
+        </w:rPr>
+        <w:t>use</w:t>
+      </w:r>
+      <w:r>
+        <w:rPr>
+          <w:b w:val="0"/>
+        </w:rPr>
+        <w:t>.</w:t>
       </w:r>
     </w:p>
     <w:p>
@@ -1359,7 +1502,22 @@
         <w:spacing w:after="100"/>
       </w:pPr>
       <w:r>
-        <w:t>A strong signal is worth 2 points and a weak one 1 point. A paper reaches the Papers sheet only if it scores at least 2 on IDENTITY and at least 2 on USE. Clearing one axis alone is never enough.</w:t>
+        <w:rPr>
+          <w:b w:val="0"/>
+        </w:rPr>
+        <w:t xml:space="preserve">Each piece of evidence is worth 2 points if it is strong and 1 point if it is weak. A paper is counted only if it scores at least 2 for identity </w:t>
+      </w:r>
+      <w:r>
+        <w:rPr>
+          <w:b/>
+        </w:rPr>
+        <w:t>and</w:t>
+      </w:r>
+      <w:r>
+        <w:rPr>
+          <w:b w:val="0"/>
+        </w:rPr>
+        <w:t xml:space="preserve"> at least 2 for use. So one strong piece of evidence settles a question on its own, two weak ones together also settle it, and a single weak one never does.</w:t>
       </w:r>
     </w:p>
     <w:p>
@@ -1367,7 +1525,22 @@
         <w:spacing w:after="100"/>
       </w:pPr>
       <w:r>
-        <w:t>Keeping the axes apart is the whole point. If the two were added into a single number, a paper could pass on identity alone: name the survey three times in an abstract, add a World Bank co-author, and a pure literature review would outscore a real empirical paper. Splitting them makes “mentions the survey but never uses the data” structurally unable to pass, which is exactly the failure the previous version had.</w:t>
+        <w:rPr>
+          <w:b w:val="0"/>
+        </w:rPr>
+        <w:t xml:space="preserve">Scoring the two questions separately is the point of the design. Added into one number, a paper could pass on name recognition alone: mention the survey three times, add a World Bank co-author, and a literature review would outrank a real empirical study. Keeping them apart makes </w:t>
+      </w:r>
+      <w:r>
+        <w:rPr>
+          <w:b/>
+        </w:rPr>
+        <w:t>“mentions the survey but never uses the data” unable to pass at all</w:t>
+      </w:r>
+      <w:r>
+        <w:rPr>
+          <w:b w:val="0"/>
+        </w:rPr>
+        <w:t>, which the previous version could not prevent.</w:t>
       </w:r>
     </w:p>
     <w:p>
@@ -1375,8 +1548,21 @@
         <w:spacing w:after="100"/>
       </w:pPr>
       <w:r>
-        <w:t>Because 2 points are needed on each axis, the arithmetic is deliberately simple: one strong signal clears an axis on its own, two weak signals clear it together, and a single weak signal never does.</w:t>
-      </w:r>
+        <w:rPr>
+          <w:b w:val="0"/>
+        </w:rPr>
+        <w:t>The evidence used for each question is listed below.</w:t>
+      </w:r>
+    </w:p>
+    <w:p>
+      <w:r>
+        <w:br w:type="page"/>
+      </w:r>
+    </w:p>
+    <w:p>
+      <w:pPr>
+        <w:spacing w:after="100"/>
+      </w:pPr>
     </w:p>
     <w:tbl>
       <w:tblPr>
@@ -1396,9 +1582,9 @@
         <w:tblLook w:val="0000" w:firstRow="0" w:lastRow="0" w:firstColumn="0" w:lastColumn="0" w:noHBand="0" w:noVBand="0"/>
       </w:tblPr>
       <w:tblGrid>
-        <w:gridCol w:w="3480"/>
-        <w:gridCol w:w="3480"/>
-        <w:gridCol w:w="3480"/>
+        <w:gridCol w:w="1400"/>
+        <w:gridCol w:w="7275"/>
+        <w:gridCol w:w="1400"/>
       </w:tblGrid>
       <w:tr>
         <w:tc>
@@ -1462,8 +1648,14 @@
             <w:tcW w:w="1400" w:type="dxa"/>
           </w:tcPr>
           <w:p>
-            <w:r>
-              <w:rPr>
+            <w:pPr>
+              <w:rPr>
+                <w:color w:val="4C94D8" w:themeColor="text2" w:themeTint="80"/>
+              </w:rPr>
+            </w:pPr>
+            <w:r>
+              <w:rPr>
+                <w:color w:val="4C94D8" w:themeColor="text2" w:themeTint="80"/>
                 <w:sz w:val="18"/>
                 <w:szCs w:val="18"/>
               </w:rPr>
@@ -1506,8 +1698,14 @@
             <w:tcW w:w="1400" w:type="dxa"/>
           </w:tcPr>
           <w:p>
-            <w:r>
-              <w:rPr>
+            <w:pPr>
+              <w:rPr>
+                <w:color w:val="4C94D8" w:themeColor="text2" w:themeTint="80"/>
+              </w:rPr>
+            </w:pPr>
+            <w:r>
+              <w:rPr>
+                <w:color w:val="4C94D8" w:themeColor="text2" w:themeTint="80"/>
                 <w:sz w:val="18"/>
                 <w:szCs w:val="18"/>
               </w:rPr>
@@ -1550,8 +1748,14 @@
             <w:tcW w:w="1400" w:type="dxa"/>
           </w:tcPr>
           <w:p>
-            <w:r>
-              <w:rPr>
+            <w:pPr>
+              <w:rPr>
+                <w:color w:val="4C94D8" w:themeColor="text2" w:themeTint="80"/>
+              </w:rPr>
+            </w:pPr>
+            <w:r>
+              <w:rPr>
+                <w:color w:val="4C94D8" w:themeColor="text2" w:themeTint="80"/>
                 <w:sz w:val="18"/>
                 <w:szCs w:val="18"/>
               </w:rPr>
@@ -1594,8 +1798,14 @@
             <w:tcW w:w="1400" w:type="dxa"/>
           </w:tcPr>
           <w:p>
-            <w:r>
-              <w:rPr>
+            <w:pPr>
+              <w:rPr>
+                <w:color w:val="4C94D8" w:themeColor="text2" w:themeTint="80"/>
+              </w:rPr>
+            </w:pPr>
+            <w:r>
+              <w:rPr>
+                <w:color w:val="4C94D8" w:themeColor="text2" w:themeTint="80"/>
                 <w:sz w:val="18"/>
                 <w:szCs w:val="18"/>
               </w:rPr>
@@ -1638,8 +1848,14 @@
             <w:tcW w:w="1400" w:type="dxa"/>
           </w:tcPr>
           <w:p>
-            <w:r>
-              <w:rPr>
+            <w:pPr>
+              <w:rPr>
+                <w:color w:val="4C94D8" w:themeColor="text2" w:themeTint="80"/>
+              </w:rPr>
+            </w:pPr>
+            <w:r>
+              <w:rPr>
+                <w:color w:val="4C94D8" w:themeColor="text2" w:themeTint="80"/>
                 <w:sz w:val="18"/>
                 <w:szCs w:val="18"/>
               </w:rPr>
@@ -1682,8 +1898,14 @@
             <w:tcW w:w="1400" w:type="dxa"/>
           </w:tcPr>
           <w:p>
-            <w:r>
-              <w:rPr>
+            <w:pPr>
+              <w:rPr>
+                <w:color w:val="4C94D8" w:themeColor="text2" w:themeTint="80"/>
+              </w:rPr>
+            </w:pPr>
+            <w:r>
+              <w:rPr>
+                <w:color w:val="4C94D8" w:themeColor="text2" w:themeTint="80"/>
                 <w:sz w:val="18"/>
                 <w:szCs w:val="18"/>
               </w:rPr>
@@ -1726,8 +1948,14 @@
             <w:tcW w:w="1400" w:type="dxa"/>
           </w:tcPr>
           <w:p>
-            <w:r>
-              <w:rPr>
+            <w:pPr>
+              <w:rPr>
+                <w:color w:val="4C94D8" w:themeColor="text2" w:themeTint="80"/>
+              </w:rPr>
+            </w:pPr>
+            <w:r>
+              <w:rPr>
+                <w:color w:val="4C94D8" w:themeColor="text2" w:themeTint="80"/>
                 <w:sz w:val="18"/>
                 <w:szCs w:val="18"/>
               </w:rPr>
@@ -1770,8 +1998,14 @@
             <w:tcW w:w="1400" w:type="dxa"/>
           </w:tcPr>
           <w:p>
-            <w:r>
-              <w:rPr>
+            <w:pPr>
+              <w:rPr>
+                <w:color w:val="4C94D8" w:themeColor="text2" w:themeTint="80"/>
+              </w:rPr>
+            </w:pPr>
+            <w:r>
+              <w:rPr>
+                <w:color w:val="4C94D8" w:themeColor="text2" w:themeTint="80"/>
                 <w:sz w:val="18"/>
                 <w:szCs w:val="18"/>
               </w:rPr>
@@ -1814,8 +2048,14 @@
             <w:tcW w:w="1400" w:type="dxa"/>
           </w:tcPr>
           <w:p>
-            <w:r>
-              <w:rPr>
+            <w:pPr>
+              <w:rPr>
+                <w:color w:val="4C94D8" w:themeColor="text2" w:themeTint="80"/>
+              </w:rPr>
+            </w:pPr>
+            <w:r>
+              <w:rPr>
+                <w:color w:val="4C94D8" w:themeColor="text2" w:themeTint="80"/>
                 <w:sz w:val="18"/>
                 <w:szCs w:val="18"/>
               </w:rPr>
@@ -1858,8 +2098,14 @@
             <w:tcW w:w="1400" w:type="dxa"/>
           </w:tcPr>
           <w:p>
-            <w:r>
-              <w:rPr>
+            <w:pPr>
+              <w:rPr>
+                <w:color w:val="BF4E14" w:themeColor="accent2" w:themeShade="BF"/>
+              </w:rPr>
+            </w:pPr>
+            <w:r>
+              <w:rPr>
+                <w:color w:val="BF4E14" w:themeColor="accent2" w:themeShade="BF"/>
                 <w:sz w:val="18"/>
                 <w:szCs w:val="18"/>
               </w:rPr>
@@ -1902,8 +2148,14 @@
             <w:tcW w:w="1400" w:type="dxa"/>
           </w:tcPr>
           <w:p>
-            <w:r>
-              <w:rPr>
+            <w:pPr>
+              <w:rPr>
+                <w:color w:val="BF4E14" w:themeColor="accent2" w:themeShade="BF"/>
+              </w:rPr>
+            </w:pPr>
+            <w:r>
+              <w:rPr>
+                <w:color w:val="BF4E14" w:themeColor="accent2" w:themeShade="BF"/>
                 <w:sz w:val="18"/>
                 <w:szCs w:val="18"/>
               </w:rPr>
@@ -1946,8 +2198,14 @@
             <w:tcW w:w="1400" w:type="dxa"/>
           </w:tcPr>
           <w:p>
-            <w:r>
-              <w:rPr>
+            <w:pPr>
+              <w:rPr>
+                <w:color w:val="BF4E14" w:themeColor="accent2" w:themeShade="BF"/>
+              </w:rPr>
+            </w:pPr>
+            <w:r>
+              <w:rPr>
+                <w:color w:val="BF4E14" w:themeColor="accent2" w:themeShade="BF"/>
                 <w:sz w:val="18"/>
                 <w:szCs w:val="18"/>
               </w:rPr>
@@ -1990,8 +2248,14 @@
             <w:tcW w:w="1400" w:type="dxa"/>
           </w:tcPr>
           <w:p>
-            <w:r>
-              <w:rPr>
+            <w:pPr>
+              <w:rPr>
+                <w:color w:val="BF4E14" w:themeColor="accent2" w:themeShade="BF"/>
+              </w:rPr>
+            </w:pPr>
+            <w:r>
+              <w:rPr>
+                <w:color w:val="BF4E14" w:themeColor="accent2" w:themeShade="BF"/>
                 <w:sz w:val="18"/>
                 <w:szCs w:val="18"/>
               </w:rPr>
@@ -2034,8 +2298,14 @@
             <w:tcW w:w="1400" w:type="dxa"/>
           </w:tcPr>
           <w:p>
-            <w:r>
-              <w:rPr>
+            <w:pPr>
+              <w:rPr>
+                <w:color w:val="BF4E14" w:themeColor="accent2" w:themeShade="BF"/>
+              </w:rPr>
+            </w:pPr>
+            <w:r>
+              <w:rPr>
+                <w:color w:val="BF4E14" w:themeColor="accent2" w:themeShade="BF"/>
                 <w:sz w:val="18"/>
                 <w:szCs w:val="18"/>
               </w:rPr>
@@ -2053,7 +2323,23 @@
                 <w:sz w:val="18"/>
                 <w:szCs w:val="18"/>
               </w:rPr>
-              <w:t>Full text: who ran, funded or implemented the survey, near its name</w:t>
+              <w:t xml:space="preserve">Full text: who ran, funded or implemented the </w:t>
+            </w:r>
+            <w:proofErr w:type="gramStart"/>
+            <w:r>
+              <w:rPr>
+                <w:sz w:val="18"/>
+                <w:szCs w:val="18"/>
+              </w:rPr>
+              <w:t>survey,</w:t>
+            </w:r>
+            <w:proofErr w:type="gramEnd"/>
+            <w:r>
+              <w:rPr>
+                <w:sz w:val="18"/>
+                <w:szCs w:val="18"/>
+              </w:rPr>
+              <w:t xml:space="preserve"> near its name</w:t>
             </w:r>
           </w:p>
         </w:tc>
@@ -2078,8 +2364,14 @@
             <w:tcW w:w="1400" w:type="dxa"/>
           </w:tcPr>
           <w:p>
-            <w:r>
-              <w:rPr>
+            <w:pPr>
+              <w:rPr>
+                <w:color w:val="BF4E14" w:themeColor="accent2" w:themeShade="BF"/>
+              </w:rPr>
+            </w:pPr>
+            <w:r>
+              <w:rPr>
+                <w:color w:val="BF4E14" w:themeColor="accent2" w:themeShade="BF"/>
                 <w:sz w:val="18"/>
                 <w:szCs w:val="18"/>
               </w:rPr>
@@ -2121,16 +2413,34 @@
       <w:pPr>
         <w:spacing w:after="100"/>
       </w:pPr>
-      <w:r>
-        <w:t>TIED versus UNTIED use evidence. This is the subtlety that makes the use axis mean anything. An abstract saying “we use household survey data” proves the authors used some data – not that they used ours. Only evidence that ties the use language to the survey itself counts in full: either the full-text pass finds the two within 40 words of each other, or the abstract both names the survey and describes using data. Generic evidence that is not tied to any particular survey (empirical vocabulary such as “regression” or “household”, or data-use language with no survey named) is capped at 1 point in total, so it can corroborate a real signal but can never carry the axis by itself.</w:t>
-      </w:r>
     </w:p>
     <w:p>
       <w:pPr>
         <w:spacing w:after="100"/>
       </w:pPr>
-      <w:r>
-        <w:t>The full-text pass (Gate 2b) is a second, separate step that runs only for papers whose USE score is still short – note, the use axis specifically, not the total. A paper can sit on a mountain of identity evidence and still show nothing about whether the data was used, and that is precisely the paper worth spending an API call on. It asks OpenAlex whether the paper's own matched survey name sits within 40 words of language describing working with the data.</w:t>
+      <w:proofErr w:type="gramStart"/>
+      <w:proofErr w:type="gramEnd"/>
+      <w:proofErr w:type="gramStart"/>
+      <w:proofErr w:type="gramEnd"/>
+      <w:proofErr w:type="gramStart"/>
+      <w:proofErr w:type="gramEnd"/>
+      <w:r>
+        <w:rPr>
+          <w:b w:val="0"/>
+        </w:rPr>
+        <w:t xml:space="preserve">One rule governs the use score. Evidence has to point at </w:t>
+      </w:r>
+      <w:r>
+        <w:rPr>
+          <w:b/>
+        </w:rPr>
+        <w:t>our</w:t>
+      </w:r>
+      <w:r>
+        <w:rPr>
+          <w:b w:val="0"/>
+        </w:rPr>
+        <w:t xml:space="preserve"> survey specifically. An abstract saying “we use household survey data” shows the authors used some data, not that they used this one. Evidence counts in full only when it is attached to the survey: either the two appear within 40 words of each other in the full text, or the abstract names the survey and describes using data in the same place. Unattached evidence, such as general statistical vocabulary, is capped at 1 point so it can support a real finding but never stand in for one.</w:t>
       </w:r>
     </w:p>
     <w:p>
@@ -2138,23 +2448,100 @@
         <w:spacing w:after="100"/>
       </w:pPr>
       <w:r>
-        <w:t>The phrases it looks for were chosen by measurement, not intuition: every candidate was run against a 36-paper review set and scored on how many genuine users versus non-users it caught. “Using data from” separates cleanly (8 real users against 1 non-user); “this paper uses” and “based on the” turned out to be negative indicators, hitting more citations than real uses, and were removed. Citing the World Bank microdata catalogue scored 2 against 2 – no separating power at all – so it is searched and reported as a flag on the paper, but earns no points.</w:t>
+        <w:rPr>
+          <w:b w:val="0"/>
+        </w:rPr>
+        <w:t xml:space="preserve">Because abstracts are short and often say nothing about data sources, a second pass searches the full text of any paper whose use score is still short. It asks whether the survey name appears within 40 words of language describing working with the data. Note that this pass is triggered by a low </w:t>
+      </w:r>
+      <w:r>
+        <w:rPr>
+          <w:b/>
+        </w:rPr>
+        <w:t>use</w:t>
+      </w:r>
+      <w:r>
+        <w:rPr>
+          <w:b w:val="0"/>
+        </w:rPr>
+        <w:t xml:space="preserve"> score specifically, not a low total: a paper can carry overwhelming evidence that it is the right survey and still show nothing about whether the data was used, and that is exactly the paper worth checking.</w:t>
       </w:r>
     </w:p>
     <w:p>
       <w:pPr>
         <w:spacing w:after="100"/>
       </w:pPr>
-      <w:r>
-        <w:t>Two rules sit outside the points. First, six publication types can never be an empirical use of survey data and are excluded outright: conference abstract, dataset, paratext, erratum, letter and software. (Editorials are deliberately not on that list.) Second, papers written as literature reviews are flagged and held to a higher bar – a review that genuinely re-analyses the microdata still passes, but it must show a strong tied use signal rather than accumulating weak ones, because reviews are the single largest category of papers that mention a survey without using it.</w:t>
-      </w:r>
-    </w:p>
-    <w:p>
-      <w:pPr>
+      <w:proofErr w:type="gramStart"/>
+      <w:proofErr w:type="gramEnd"/>
+      <w:r>
+        <w:rPr>
+          <w:b w:val="0"/>
+        </w:rPr>
+        <w:t xml:space="preserve">The phrases it searches for were chosen by measurement rather than intuition. Every candidate phrase was tested against a 36-paper set that had already been assessed by hand, and scored on how many genuine users against how many non-users it caught. “Using data from” separated cleanly, catching 8 real users and 1 non-user. “This paper uses” and “based on the” proved to be </w:t>
+      </w:r>
+      <w:r>
+        <w:rPr>
+          <w:b/>
+        </w:rPr>
+        <w:t>negative</w:t>
+      </w:r>
+      <w:r>
+        <w:rPr>
+          <w:b w:val="0"/>
+        </w:rPr>
+        <w:t xml:space="preserve"> indicators, appearing more often in citations than in real use, and were removed. Citing the World Bank microdata catalogue scored 2 against 2, no separating power at all, so it is recorded on the paper as a note but earns no points.</w:t>
+      </w:r>
+    </w:p>
+    <w:p>
+      <w:pPr>
+        <w:pStyle w:val="Heading2"/>
         <w:spacing w:after="100"/>
       </w:pPr>
-      <w:r>
-        <w:t>Every signal that fired is written to the relevance_flags column, and the two axis scores to identity_score and use_score, so any decision can be traced back to its reasons.</w:t>
+      <w:proofErr w:type="gramStart"/>
+      <w:proofErr w:type="gramEnd"/>
+      <w:r>
+        <w:rPr>
+          <w:b w:val="0"/>
+        </w:rPr>
+        <w:t>2.6 Rules that override the score</w:t>
+      </w:r>
+    </w:p>
+    <w:p>
+      <w:pPr>
+        <w:spacing w:after="100"/>
+      </w:pPr>
+      <w:proofErr w:type="gramStart"/>
+      <w:proofErr w:type="gramEnd"/>
+      <w:r>
+        <w:rPr>
+          <w:b w:val="0"/>
+        </w:rPr>
+        <w:t>Two rules sit outside the scoring. Six publication types can never be an empirical use of survey data and are excluded regardless of score: conference abstract, dataset, paratext, erratum, letter and software. Editorials are deliberately not on that list.</w:t>
+      </w:r>
+    </w:p>
+    <w:p>
+      <w:pPr>
+        <w:spacing w:after="100"/>
+      </w:pPr>
+      <w:proofErr w:type="gramStart"/>
+      <w:proofErr w:type="gramEnd"/>
+      <w:r>
+        <w:rPr>
+          <w:b w:val="0"/>
+        </w:rPr>
+        <w:t>Literature reviews are held to a higher standard rather than excluded. A review that genuinely re-analyses the data still counts, but it must show one strong piece of attached evidence rather than an accumulation of weak ones, because reviews are the largest single category of papers that name a survey without using it.</w:t>
+      </w:r>
+    </w:p>
+    <w:p>
+      <w:pPr>
+        <w:spacing w:after="100"/>
+      </w:pPr>
+      <w:proofErr w:type="gramStart"/>
+      <w:proofErr w:type="gramEnd"/>
+      <w:r>
+        <w:rPr>
+          <w:b w:val="0"/>
+        </w:rPr>
+        <w:t>Every piece of evidence that applied is written to the workbook, along with both scores, so any decision can be traced back to its reasons.</w:t>
       </w:r>
     </w:p>
     <w:p>
@@ -2163,7 +2550,7 @@
         <w:spacing w:before="180" w:after="80"/>
       </w:pPr>
       <w:r>
-        <w:t>2.5 Deduplication</w:t>
+        <w:t>2.7 Removing duplicate records</w:t>
       </w:r>
     </w:p>
     <w:p>
@@ -2180,7 +2567,7 @@
         <w:spacing w:before="180" w:after="80"/>
       </w:pPr>
       <w:r>
-        <w:t>2.6 Fiscal year and geography</w:t>
+        <w:t>2.8 Fiscal year and author geography</w:t>
       </w:r>
     </w:p>
     <w:p>
@@ -2252,11 +2639,23 @@
     </w:p>
     <w:p>
       <w:pPr>
+        <w:rPr>
+          <w:color w:val="2E74B5"/>
+          <w:sz w:val="26"/>
+          <w:szCs w:val="26"/>
+        </w:rPr>
+      </w:pPr>
+      <w:r>
+        <w:br w:type="page"/>
+      </w:r>
+    </w:p>
+    <w:p>
+      <w:pPr>
         <w:pStyle w:val="Heading2"/>
         <w:spacing w:before="180" w:after="80"/>
       </w:pPr>
       <w:r>
-        <w:t>2.7 What it outputs</w:t>
+        <w:t>2.9 What the workbook contains</w:t>
       </w:r>
     </w:p>
     <w:p>
@@ -2360,41 +2759,25 @@
                 <w:sz w:val="18"/>
                 <w:szCs w:val="18"/>
               </w:rPr>
-              <w:t>One row per discovered paper: title, DOI, authors, institutional affiliations, publication year/FY, dataset country, research topic, peer-reviewed / working-paper flag, journal tier, the identity and use scores, and the individual signals that fired (relevance_flags).</w:t>
-            </w:r>
+              <w:t xml:space="preserve">One row per discovered paper: title, DOI, authors, institutional affiliations, publication year/FY, dataset country, research topic, peer-reviewed / working-paper flag, journal tier, </w:t>
+            </w:r>
+            <w:proofErr w:type="gramStart"/>
             <w:r>
               <w:rPr>
                 <w:color w:val="000000"/>
                 <w:sz w:val="18"/>
                 <w:szCs w:val="18"/>
               </w:rPr>
-            </w:r>
+              <w:t>the identity</w:t>
+            </w:r>
+            <w:proofErr w:type="gramEnd"/>
             <w:r>
               <w:rPr>
                 <w:color w:val="000000"/>
                 <w:sz w:val="18"/>
                 <w:szCs w:val="18"/>
               </w:rPr>
-            </w:r>
-            <w:r>
-              <w:rPr>
-                <w:color w:val="000000"/>
-                <w:sz w:val="18"/>
-                <w:szCs w:val="18"/>
-              </w:rPr>
-            </w:r>
-            <w:r>
-              <w:rPr>
-                <w:color w:val="000000"/>
-                <w:sz w:val="18"/>
-                <w:szCs w:val="18"/>
-              </w:rPr>
-            </w:r>
-            <w:r>
-              <w:rPr>
-                <w:sz w:val="18"/>
-                <w:szCs w:val="18"/>
-              </w:rPr>
+              <w:t xml:space="preserve"> and use scores, and the individual signals that fired (relevance_flags).</w:t>
             </w:r>
           </w:p>
         </w:tc>
@@ -2426,7 +2809,25 @@
                 <w:sz w:val="18"/>
                 <w:szCs w:val="18"/>
               </w:rPr>
-              <w:t>The headline FLOW and Africa-SHARE numbers, a breakdown by match tier (strongest tier per paper, so the three sum to 100%) and by the identity/use axes, plus the summary charts. Charts sit near the top of the sheet.</w:t>
+              <w:t xml:space="preserve">The headline FLOW and Africa-SHARE numbers, a breakdown by match tier (strongest tier per paper, so the three sum to 100%) and by </w:t>
+            </w:r>
+            <w:proofErr w:type="gramStart"/>
+            <w:r>
+              <w:rPr>
+                <w:color w:val="000000"/>
+                <w:sz w:val="18"/>
+                <w:szCs w:val="18"/>
+              </w:rPr>
+              <w:t>the identity</w:t>
+            </w:r>
+            <w:proofErr w:type="gramEnd"/>
+            <w:r>
+              <w:rPr>
+                <w:color w:val="000000"/>
+                <w:sz w:val="18"/>
+                <w:szCs w:val="18"/>
+              </w:rPr>
+              <w:t>/use axes, plus the summary charts. Charts sit near the top of the sheet.</w:t>
             </w:r>
           </w:p>
         </w:tc>
@@ -2490,37 +2891,25 @@
                 <w:sz w:val="18"/>
                 <w:szCs w:val="18"/>
               </w:rPr>
-              <w:t>All 109 keywords, each with its tier, the matching rule applied, the required country context words, and the exact OpenAlex query sent, so any result can be traced back to the search that found it.</w:t>
-            </w:r>
-            <w:proofErr w:type="spellStart"/>
+              <w:t xml:space="preserve">All 109 keywords, each with </w:t>
+            </w:r>
+            <w:proofErr w:type="gramStart"/>
             <w:r>
               <w:rPr>
                 <w:color w:val="000000"/>
                 <w:sz w:val="18"/>
                 <w:szCs w:val="18"/>
               </w:rPr>
-            </w:r>
-            <w:proofErr w:type="spellEnd"/>
+              <w:t>its tier</w:t>
+            </w:r>
+            <w:proofErr w:type="gramEnd"/>
             <w:r>
               <w:rPr>
                 <w:color w:val="000000"/>
                 <w:sz w:val="18"/>
                 <w:szCs w:val="18"/>
               </w:rPr>
-            </w:r>
-            <w:r>
-              <w:rPr>
-                <w:color w:val="000000"/>
-                <w:sz w:val="18"/>
-                <w:szCs w:val="18"/>
-              </w:rPr>
-            </w:r>
-            <w:r>
-              <w:rPr>
-                <w:color w:val="000000"/>
-                <w:sz w:val="18"/>
-                <w:szCs w:val="18"/>
-              </w:rPr>
+              <w:t>, the matching rule applied, the required country context words, and the exact OpenAlex query sent, so any result can be traced back to the search that found it.</w:t>
             </w:r>
           </w:p>
         </w:tc>
@@ -2584,14 +2973,32 @@
                 <w:sz w:val="18"/>
                 <w:szCs w:val="18"/>
               </w:rPr>
-              <w:t>Papers that matched a keyword but scored 0</w:t>
-            </w:r>
+              <w:t xml:space="preserve">Papers that matched </w:t>
+            </w:r>
+            <w:proofErr w:type="gramStart"/>
             <w:r>
               <w:rPr>
                 <w:color w:val="000000"/>
                 <w:sz w:val="18"/>
                 <w:szCs w:val="18"/>
               </w:rPr>
+              <w:t>a keyword</w:t>
+            </w:r>
+            <w:proofErr w:type="gramEnd"/>
+            <w:r>
+              <w:rPr>
+                <w:color w:val="000000"/>
+                <w:sz w:val="18"/>
+                <w:szCs w:val="18"/>
+              </w:rPr>
+              <w:t xml:space="preserve"> but scored 0</w:t>
+            </w:r>
+            <w:r>
+              <w:rPr>
+                <w:color w:val="000000"/>
+                <w:sz w:val="18"/>
+                <w:szCs w:val="18"/>
+              </w:rPr>
               <w:t xml:space="preserve"> or 1</w:t>
             </w:r>
             <w:r>
@@ -2600,7 +3007,25 @@
                 <w:sz w:val="18"/>
                 <w:szCs w:val="18"/>
               </w:rPr>
-              <w:t xml:space="preserve"> on relevance. Kept for reference, but excluded from every headline count and chart. Always the last sheet.</w:t>
+              <w:t xml:space="preserve"> on relevance. Kept for </w:t>
+            </w:r>
+            <w:proofErr w:type="gramStart"/>
+            <w:r>
+              <w:rPr>
+                <w:color w:val="000000"/>
+                <w:sz w:val="18"/>
+                <w:szCs w:val="18"/>
+              </w:rPr>
+              <w:t>reference, but</w:t>
+            </w:r>
+            <w:proofErr w:type="gramEnd"/>
+            <w:r>
+              <w:rPr>
+                <w:color w:val="000000"/>
+                <w:sz w:val="18"/>
+                <w:szCs w:val="18"/>
+              </w:rPr>
+              <w:t xml:space="preserve"> excluded from every headline count and chart. Always the last sheet.</w:t>
             </w:r>
           </w:p>
         </w:tc>
@@ -2619,16 +3044,24 @@
       <w:pPr>
         <w:pStyle w:val="Heading2"/>
         <w:rPr>
+          <w:sz w:val="32"/>
+          <w:szCs w:val="32"/>
+        </w:rPr>
+      </w:pPr>
+      <w:r>
+        <w:t>2.10 Known limits</w:t>
+      </w:r>
+    </w:p>
+    <w:p>
+      <w:pPr>
+        <w:rPr>
           <w:color w:val="2E74B5"/>
           <w:sz w:val="32"/>
           <w:szCs w:val="32"/>
         </w:rPr>
       </w:pPr>
       <w:r>
-        <w:rPr>
-          <w:b w:val="0"/>
-        </w:rPr>
-        <w:t>2.8 Known limits</w:t>
+        <w:t>Two kinds of error remain, and both follow from the same constraint. OpenAlex allows the pipeline to ask whether two phrases appear near each other in a paper, but it does not hand over the text itself. The pipeline therefore cannot tell which part of a paper a phrase came from, and a name in the reference list looks the same to it as a name in the methods section.</w:t>
       </w:r>
     </w:p>
     <w:p>
@@ -2641,9 +3074,15 @@
       </w:pPr>
       <w:r>
         <w:rPr>
+          <w:b/>
+        </w:rPr>
+        <w:t>Reference-only matches.</w:t>
+      </w:r>
+      <w:r>
+        <w:rPr>
           <w:b w:val="0"/>
         </w:rPr>
-        <w:t>Two categories of error remain, and both follow from the same constraint: OpenAlex exposes a search index over full text, not the text itself, so the pipeline can ask whether two phrases occur near each other but cannot see which section they occur in.</w:t>
+        <w:t xml:space="preserve"> A paper that cites a survey without using it still contains the survey name, and a dataset citation carries collection language of its own, for example “Uganda National Panel Survey 2019-2020, collected by Uganda Bureau of Statistics”. That is indistinguishable from a methods sentence when only the distance between words is visible. Four papers in the review set are counted this way when they should not be.</w:t>
       </w:r>
     </w:p>
     <w:p>
@@ -2658,13 +3097,10 @@
         <w:rPr>
           <w:b/>
         </w:rPr>
-        <w:t>Reference-only matches.</w:t>
-      </w:r>
-      <w:r>
-        <w:rPr>
-          <w:b w:val="0"/>
-        </w:rPr>
-        <w:t xml:space="preserve"> A paper that cites a survey without using it still contains the survey name, and a dataset citation carries collection language of its own, for example “Uganda National Panel Survey 2019-2020, collected by Uganda Bureau of Statistics”. Proximity cannot separate that from a methods sentence, because both appear in the same document. Four papers in the review set pass this way.</w:t>
+        <w:t>Unindexed data statements.</w:t>
+      </w:r>
+      <w:r>
+        <w:t xml:space="preserve"> Some papers declare their data in a table or a dataset section that OpenAlex has not indexed. In one verified case the phrase “Living Standards Measurement Study” appears in the paper's own dataset section yet is absent from the index at every query length and proximity setting, while the acronym alone is present. No query formulation reaches that paper.</w:t>
       </w:r>
     </w:p>
     <w:p>
@@ -2676,16 +3112,29 @@
         </w:rPr>
       </w:pPr>
       <w:r>
+        <w:t xml:space="preserve">Section-aware analysis would address </w:t>
+      </w:r>
+      <w:proofErr w:type="gramStart"/>
+      <w:r>
+        <w:t>both, and</w:t>
+      </w:r>
+      <w:proofErr w:type="gramEnd"/>
+      <w:r>
+        <w:t xml:space="preserve"> was tested. Europe PMC returns sectioned full </w:t>
+      </w:r>
+      <w:proofErr w:type="gramStart"/>
+      <w:r>
+        <w:t>text</w:t>
+      </w:r>
+      <w:proofErr w:type="gramEnd"/>
+      <w:r>
+        <w:t xml:space="preserve"> and separates use from mention correctly where it has coverage, but it indexes none of the economics venues this corpus depends on, covering 4 of 10 sample papers and misclassifying one genuine user. </w:t>
+      </w:r>
+      <w:r>
         <w:rPr>
           <w:b/>
         </w:rPr>
-        <w:t>Unindexed data statements.</w:t>
-      </w:r>
-      <w:r>
-        <w:rPr>
-          <w:b w:val="0"/>
-        </w:rPr>
-        <w:t xml:space="preserve"> Some papers declare their data in a table or a dataset section that OpenAlex has not indexed. In one verified case the phrase “Living Standards Measurement Study” appears in the paper's own dataset section yet is absent from the index at every query length and proximity setting, while the acronym alone is present. No query formulation reaches that paper.</w:t>
+        <w:t>Closing these gaps requires a full-text source with reliable coverage of development and agricultural economics, not further tuning of the current signals.</w:t>
       </w:r>
     </w:p>
     <w:p>
@@ -2697,16 +3146,7 @@
         </w:rPr>
       </w:pPr>
       <w:r>
-        <w:rPr>
-          <w:b w:val="0"/>
-        </w:rPr>
-        <w:t xml:space="preserve">Section-aware analysis would address both, and was tested. Europe PMC returns sectioned full text and separates use from mention correctly where it has coverage, but it indexes none of the economics venues this corpus depends on, covering 4 of 10 sample papers and misclassifying one genuine user. </w:t>
-      </w:r>
-      <w:r>
-        <w:rPr>
-          <w:b/>
-        </w:rPr>
-        <w:t>Closing these gaps requires a full-text source with reliable coverage of development and agricultural economics, not further tuning of the current signals.</w:t>
+        <w:br w:type="page"/>
       </w:r>
     </w:p>
     <w:p>
@@ -3375,7 +3815,15 @@
         <w:spacing w:after="40"/>
       </w:pPr>
       <w:r>
-        <w:t>When it says “Setup Complete,” you can close the window.</w:t>
+        <w:t xml:space="preserve">When it </w:t>
+      </w:r>
+      <w:proofErr w:type="gramStart"/>
+      <w:r>
+        <w:t>says</w:t>
+      </w:r>
+      <w:proofErr w:type="gramEnd"/>
+      <w:r>
+        <w:t xml:space="preserve"> “Setup Complete,” you can close the window.</w:t>
       </w:r>
     </w:p>
     <w:p>
@@ -3391,7 +3839,23 @@
           <w:i/>
           <w:iCs/>
         </w:rPr>
-        <w:t>This step needs an internet connection and usually takes one to two minutes (longer if Python itself has to be downloaded and installed)</w:t>
+        <w:t xml:space="preserve">This step needs an internet connection and usually takes one to two minutes (longer if Python itself </w:t>
+      </w:r>
+      <w:proofErr w:type="gramStart"/>
+      <w:r>
+        <w:rPr>
+          <w:i/>
+          <w:iCs/>
+        </w:rPr>
+        <w:t>has to</w:t>
+      </w:r>
+      <w:proofErr w:type="gramEnd"/>
+      <w:r>
+        <w:rPr>
+          <w:i/>
+          <w:iCs/>
+        </w:rPr>
+        <w:t xml:space="preserve"> be downloaded and installed)</w:t>
       </w:r>
       <w:r>
         <w:rPr>
@@ -3657,8 +4121,13 @@
       <w:r>
         <w:t>--</w:t>
       </w:r>
-      <w:r>
-        <w:t>usually about 5 minutes. Leave the window open.</w:t>
+      <w:proofErr w:type="gramStart"/>
+      <w:r>
+        <w:t>usually</w:t>
+      </w:r>
+      <w:proofErr w:type="gramEnd"/>
+      <w:r>
+        <w:t xml:space="preserve"> about 5 minutes. Leave the window open.</w:t>
       </w:r>
     </w:p>
     <w:p>
@@ -3676,8 +4145,13 @@
       <w:r>
         <w:t xml:space="preserve">. </w:t>
       </w:r>
-      <w:r>
-        <w:t>click it to open the workbook directly.</w:t>
+      <w:proofErr w:type="gramStart"/>
+      <w:r>
+        <w:t>click it to</w:t>
+      </w:r>
+      <w:proofErr w:type="gramEnd"/>
+      <w:r>
+        <w:t xml:space="preserve"> open the workbook directly.</w:t>
       </w:r>
     </w:p>
     <w:sectPr>

</xml_diff>

<commit_message>
Add the presentation documentation and a sample run output
Documentation as presented: executive summary, the three-tier and two-axis
explanations, and section 2.10 on known limits.

Also includes one full run's workbook (2026-08-05, 7,800 papers) as a
reference output, force-added past the ignore rule so reviewers can see the
shape of the result without running the pipeline. It is 15 MB, so this is a
one-off sample rather than a habit -- generated outputs stay ignored.
</commit_message>
<xml_diff>
--- a/LSMS_Impact_Analysis_Pipeline_Documentation.docx
+++ b/LSMS_Impact_Analysis_Pipeline_Documentation.docx
@@ -86,7 +86,15 @@
       </w:r>
       <w:proofErr w:type="gramEnd"/>
       <w:r>
-        <w:t xml:space="preserve"> LSMS data? It searches OpenAlex, the largest open index of scholarly work, for 109 survey keywords across 10 survey families, and then decides, paper by paper, whether the match reflects genuine use of the data or only a passing mention. </w:t>
+        <w:t xml:space="preserve"> LSMS data? It searches </w:t>
+      </w:r>
+      <w:proofErr w:type="spellStart"/>
+      <w:r>
+        <w:t>OpenAlex</w:t>
+      </w:r>
+      <w:proofErr w:type="spellEnd"/>
+      <w:r>
+        <w:t xml:space="preserve">, the largest open index of scholarly work, for 109 survey keywords across 10 survey families, and then decides, paper by paper, whether the match reflects genuine use of the data or only a passing mention. </w:t>
       </w:r>
       <w:r>
         <w:rPr>
@@ -140,7 +148,15 @@
         </w:rPr>
       </w:pPr>
       <w:r>
-        <w:t xml:space="preserve">Two further decisions matter for accuracy. Searches run unstemmed, because OpenAlex by default treats LSMS and LSM as the same word and returns the entire land-surface model literature: 13,506 results for a single fiscal year against 698 unstemmed. And the phrase lists that detect data use were selected by measurement against a 36-paper review set rather than by intuition, which removed three phrases that turned out to indicate citation rather than use. </w:t>
+        <w:t xml:space="preserve">Two further decisions matter for accuracy. Searches run unstemmed, because </w:t>
+      </w:r>
+      <w:proofErr w:type="spellStart"/>
+      <w:r>
+        <w:t>OpenAlex</w:t>
+      </w:r>
+      <w:proofErr w:type="spellEnd"/>
+      <w:r>
+        <w:t xml:space="preserve"> by default treats LSMS and LSM as the same word and returns the entire land-surface model literature: 13,506 results for a single fiscal year against 698 unstemmed. And the phrase lists that detect data use were selected by measurement against a 36-paper review set rather than by intuition, which removed three phrases that turned out to indicate citation rather than use. </w:t>
       </w:r>
       <w:r>
         <w:rPr>
@@ -161,7 +177,15 @@
         </w:rPr>
       </w:pPr>
       <w:r>
-        <w:t>The remaining disagreements are understood rather than mysterious. They divide into papers whose survey name appears only in the reference list, and papers whose data use is declared in a table or dataset section that OpenAlex does not index. Both limits are set out in section 2.10.</w:t>
+        <w:t xml:space="preserve">The remaining disagreements are understood rather than mysterious. They divide into papers whose survey name appears only in the reference list, and papers whose data use is declared in a table or dataset section that </w:t>
+      </w:r>
+      <w:proofErr w:type="spellStart"/>
+      <w:r>
+        <w:t>OpenAlex</w:t>
+      </w:r>
+      <w:proofErr w:type="spellEnd"/>
+      <w:r>
+        <w:t xml:space="preserve"> does not index. Both limits are set out in section 2.10.</w:t>
       </w:r>
     </w:p>
     <w:tbl>
@@ -275,12 +299,21 @@
             <w:tcW w:w="7675" w:type="dxa"/>
           </w:tcPr>
           <w:p>
-            <w:r>
-              <w:rPr>
-                <w:sz w:val="18"/>
-                <w:szCs w:val="18"/>
-              </w:rPr>
-              <w:t>OpenAlex, covering journal articles, working papers, preprints and grey literature, searched against title, abstract and full text</w:t>
+            <w:proofErr w:type="spellStart"/>
+            <w:r>
+              <w:rPr>
+                <w:sz w:val="18"/>
+                <w:szCs w:val="18"/>
+              </w:rPr>
+              <w:t>OpenAlex</w:t>
+            </w:r>
+            <w:proofErr w:type="spellEnd"/>
+            <w:r>
+              <w:rPr>
+                <w:sz w:val="18"/>
+                <w:szCs w:val="18"/>
+              </w:rPr>
+              <w:t>, covering journal articles, working papers, preprints and grey literature, searched against title, abstract and full text</w:t>
             </w:r>
           </w:p>
         </w:tc>
@@ -947,9 +980,6 @@
         <w:spacing w:before="280" w:after="110"/>
       </w:pPr>
       <w:r>
-        <w:rPr>
-          <w:b w:val="0"/>
-        </w:rPr>
         <w:t>2.1 How the pipeline works</w:t>
       </w:r>
     </w:p>
@@ -958,9 +988,6 @@
         <w:spacing w:before="280" w:after="110"/>
       </w:pPr>
       <w:r>
-        <w:rPr>
-          <w:b w:val="0"/>
-        </w:rPr>
         <w:t>The pipeline runs in two steps. Everything else in this section belongs to one or the other, so it is worth separating them clearly before going further.</w:t>
       </w:r>
     </w:p>
@@ -970,9 +997,22 @@
       </w:pPr>
       <w:r>
         <w:rPr>
-          <w:b w:val="0"/>
-        </w:rPr>
-        <w:t>Step one searches for the survey names and collects every paper that mentions one. It is deliberately generous. Missing a paper here is permanent, whereas collecting one that turns out to be irrelevant costs nothing but a later rejection.</w:t>
+          <w:b/>
+          <w:bCs/>
+          <w:u w:val="single"/>
+        </w:rPr>
+        <w:t>Step one</w:t>
+      </w:r>
+      <w:r>
+        <w:rPr>
+          <w:b/>
+          <w:bCs/>
+          <w:u w:val="single"/>
+        </w:rPr>
+        <w:t xml:space="preserve"> (Gate 1)</w:t>
+      </w:r>
+      <w:r>
+        <w:t xml:space="preserve"> searches for the survey names and collects every paper that mentions one. It is deliberately generous. Missing a paper here is permanent, whereas collecting one that turns out to be irrelevant costs nothing but a later rejection.</w:t>
       </w:r>
     </w:p>
     <w:p>
@@ -981,32 +1021,39 @@
       </w:pPr>
       <w:r>
         <w:rPr>
-          <w:b w:val="0"/>
-        </w:rPr>
-        <w:t xml:space="preserve">Step two examines each collected paper and decides whether it actually used the survey data. This is where most of the work happens, because </w:t>
-      </w:r>
-      <w:r>
-        <w:rPr>
           <w:b/>
+          <w:bCs/>
+          <w:u w:val="single"/>
+        </w:rPr>
+        <w:t>Step two</w:t>
+      </w:r>
+      <w:r>
+        <w:rPr>
+          <w:b/>
+          <w:bCs/>
+          <w:u w:val="single"/>
+        </w:rPr>
+        <w:t xml:space="preserve"> (Gate 2)</w:t>
+      </w:r>
+      <w:r>
+        <w:t xml:space="preserve"> examines each collected paper and decides whether it </w:t>
+      </w:r>
+      <w:proofErr w:type="gramStart"/>
+      <w:r>
+        <w:t>actually used</w:t>
+      </w:r>
+      <w:proofErr w:type="gramEnd"/>
+      <w:r>
+        <w:t xml:space="preserve"> the survey data. This is where most of the work happens, because </w:t>
+      </w:r>
+      <w:r>
+        <w:rPr>
+          <w:b/>
         </w:rPr>
         <w:t>most papers that mention a survey never use it</w:t>
       </w:r>
       <w:r>
-        <w:rPr>
-          <w:b w:val="0"/>
-        </w:rPr>
         <w:t>. They cite it, credit it, or list it as related work.</w:t>
-      </w:r>
-    </w:p>
-    <w:p>
-      <w:pPr>
-        <w:spacing w:before="280" w:after="110"/>
-      </w:pPr>
-      <w:r>
-        <w:rPr>
-          <w:b w:val="0"/>
-        </w:rPr>
-        <w:t>In the code and in the output columns these two steps are called Gate 1 and Gate 2.</w:t>
       </w:r>
     </w:p>
     <w:p>
@@ -1062,9 +1109,6 @@
         <w:spacing w:after="100"/>
       </w:pPr>
       <w:r>
-        <w:rPr>
-          <w:b w:val="0"/>
-        </w:rPr>
         <w:t>The search terms are the keyword list the LSMS team already used in its Google Alerts tracker, 109 terms across 10 survey families. A few entries were merged or dropped as duplicates, for example “The Uganda National Panel survey”, which could never match anything that the shorter “Uganda National Panel Survey” did not already catch.</w:t>
       </w:r>
     </w:p>
@@ -1073,9 +1117,6 @@
         <w:spacing w:after="100"/>
       </w:pPr>
       <w:r>
-        <w:rPr>
-          <w:b w:val="0"/>
-        </w:rPr>
         <w:t xml:space="preserve">These names differ enormously in how ambiguous they are. “Uganda National Panel Survey” cannot plausibly appear outside LSMS-related work. The acronym “IHS” appears in thousands of unrelated papers about health plans and hospital systems. And some are real survey titles whose words describe the survey rather than identify it: “National Panel Survey” belongs to both Tanzania and Uganda, and almost every agency ran a “High-Frequency Phone Survey” during COVID. One rule for all three would either discard real papers or admit irrelevant ones, so </w:t>
       </w:r>
       <w:r>
@@ -1085,9 +1126,6 @@
         <w:t>each keyword carries one of three tiers</w:t>
       </w:r>
       <w:r>
-        <w:rPr>
-          <w:b w:val="0"/>
-        </w:rPr>
         <w:t>:</w:t>
       </w:r>
     </w:p>
@@ -1245,7 +1283,25 @@
                 <w:sz w:val="18"/>
                 <w:szCs w:val="18"/>
               </w:rPr>
-              <w:t>Unambiguous: the name contains a country, or an acronym that cannot plausibly mean anything else. A full-text match is accepted on its own – no country context and no field filter. Most genuine papers name their data source in the Methods section rather than the abstract, and OpenAlex indexes full text, so this is the tier that does most of the work.</w:t>
+              <w:t xml:space="preserve">Unambiguous: the name contains a country, or an acronym that cannot plausibly mean anything else. A full-text match is accepted on its own – no country context and no field filter. Most genuine papers name their data source in the Methods section rather than the abstract, and </w:t>
+            </w:r>
+            <w:proofErr w:type="spellStart"/>
+            <w:r>
+              <w:rPr>
+                <w:color w:val="000000"/>
+                <w:sz w:val="18"/>
+                <w:szCs w:val="18"/>
+              </w:rPr>
+              <w:t>OpenAlex</w:t>
+            </w:r>
+            <w:proofErr w:type="spellEnd"/>
+            <w:r>
+              <w:rPr>
+                <w:color w:val="000000"/>
+                <w:sz w:val="18"/>
+                <w:szCs w:val="18"/>
+              </w:rPr>
+              <w:t xml:space="preserve"> indexes full text, so this is the tier that does most of the work.</w:t>
             </w:r>
           </w:p>
         </w:tc>
@@ -1307,7 +1363,25 @@
                 <w:sz w:val="18"/>
                 <w:szCs w:val="18"/>
               </w:rPr>
-              <w:t>A real survey name, but a generic one: the words describe the survey rather than identify it, and other countries or programmes use the same phrase. Requires an LSMS country word somewhere in the document AND an allowed subject field. Case-insensitive – casing carries no information in a phrase.</w:t>
+              <w:t xml:space="preserve">A real survey name, but a generic one: the words describe the survey rather than identify it, and other countries or </w:t>
+            </w:r>
+            <w:proofErr w:type="spellStart"/>
+            <w:r>
+              <w:rPr>
+                <w:color w:val="000000"/>
+                <w:sz w:val="18"/>
+                <w:szCs w:val="18"/>
+              </w:rPr>
+              <w:t>programmes</w:t>
+            </w:r>
+            <w:proofErr w:type="spellEnd"/>
+            <w:r>
+              <w:rPr>
+                <w:color w:val="000000"/>
+                <w:sz w:val="18"/>
+                <w:szCs w:val="18"/>
+              </w:rPr>
+              <w:t xml:space="preserve"> use the same phrase. Requires an LSMS country word somewhere in the document AND an allowed subject field. Case-insensitive – casing carries no information in a phrase.</w:t>
             </w:r>
           </w:p>
         </w:tc>
@@ -1388,15 +1462,16 @@
       <w:pPr>
         <w:spacing w:after="100"/>
       </w:pPr>
-      <w:proofErr w:type="gramStart"/>
-      <w:proofErr w:type="gramEnd"/>
-      <w:proofErr w:type="gramStart"/>
-      <w:proofErr w:type="gramEnd"/>
-      <w:r>
-        <w:rPr>
-          <w:b w:val="0"/>
-        </w:rPr>
-        <w:t xml:space="preserve">Search engines normally treat related words as equivalent, so a search for LSMS also returns LSM, the standard abbreviation for land-surface model. That single behaviour returned </w:t>
+      <w:r>
+        <w:t xml:space="preserve">Search engines normally treat related words as equivalent, so a search for LSMS also returns LSM, the standard abbreviation for land-surface model. That single </w:t>
+      </w:r>
+      <w:proofErr w:type="spellStart"/>
+      <w:r>
+        <w:t>behaviour</w:t>
+      </w:r>
+      <w:proofErr w:type="spellEnd"/>
+      <w:r>
+        <w:t xml:space="preserve"> returned </w:t>
       </w:r>
       <w:r>
         <w:rPr>
@@ -1405,10 +1480,15 @@
         <w:t>13,506 results for one fiscal year where the correct number was 698</w:t>
       </w:r>
       <w:r>
-        <w:rPr>
-          <w:b w:val="0"/>
-        </w:rPr>
-        <w:t>. Searches therefore run in exact mode, which switches that off. Exact mode still ignores capitalisation, so “LSMs” and “LSMS” remain identical to the search engine, which is what the Tier C case check in the table above is for.</w:t>
+        <w:t xml:space="preserve">. Searches therefore run in exact mode, which switches that off. Exact mode still ignores </w:t>
+      </w:r>
+      <w:proofErr w:type="spellStart"/>
+      <w:r>
+        <w:t>capitalisation</w:t>
+      </w:r>
+      <w:proofErr w:type="spellEnd"/>
+      <w:r>
+        <w:t>, so “LSMs” and “LSMS” remain identical to the search engine, which is what the Tier C case check in the table above is for.</w:t>
       </w:r>
     </w:p>
     <w:p>
@@ -1419,20 +1499,21 @@
       <w:r>
         <w:t>2.5 Step two: separating genuine use from a passing mention</w:t>
       </w:r>
+    </w:p>
+    <w:p>
+      <w:pPr>
+        <w:spacing w:after="100"/>
+      </w:pPr>
+      <w:r>
+        <w:t xml:space="preserve">Finding a survey name proves only that the words appear somewhere in the paper. Step two therefore asks two different questions about every </w:t>
+      </w:r>
       <w:proofErr w:type="gramStart"/>
-      <w:r/>
+      <w:r>
+        <w:t>collected paper</w:t>
+      </w:r>
       <w:proofErr w:type="gramEnd"/>
-      <w:r/>
-    </w:p>
-    <w:p>
-      <w:pPr>
-        <w:spacing w:after="100"/>
-      </w:pPr>
-      <w:r>
-        <w:rPr>
-          <w:b w:val="0"/>
-        </w:rPr>
-        <w:t>Finding a survey name proves only that the words appear somewhere in the paper. Step two therefore asks two different questions about every collected paper and scores them separately:</w:t>
+      <w:r>
+        <w:t xml:space="preserve"> and scores them separately:</w:t>
       </w:r>
     </w:p>
     <w:p>
@@ -1447,10 +1528,15 @@
         <w:t>Is this really one of our surveys?</w:t>
       </w:r>
       <w:r>
-        <w:rPr>
-          <w:b w:val="0"/>
-        </w:rPr>
-        <w:t xml:space="preserve"> A name can collide with an unrelated acronym, or belong to another country's survey that happens to share a phrase. This score is called </w:t>
+        <w:t xml:space="preserve"> A name can collide with an unrelated </w:t>
+      </w:r>
+      <w:proofErr w:type="gramStart"/>
+      <w:r>
+        <w:t>acronym, or</w:t>
+      </w:r>
+      <w:proofErr w:type="gramEnd"/>
+      <w:r>
+        <w:t xml:space="preserve"> belong to another country's survey that happens to share a phrase. This score is called </w:t>
       </w:r>
       <w:r>
         <w:rPr>
@@ -1459,9 +1545,6 @@
         <w:t>identity</w:t>
       </w:r>
       <w:r>
-        <w:rPr>
-          <w:b w:val="0"/>
-        </w:rPr>
         <w:t>.</w:t>
       </w:r>
     </w:p>
@@ -1470,18 +1553,27 @@
         <w:pStyle w:val="ListParagraph"/>
         <w:spacing w:after="100"/>
       </w:pPr>
+      <w:r>
+        <w:rPr>
+          <w:b/>
+        </w:rPr>
+        <w:t xml:space="preserve">Did the authors </w:t>
+      </w:r>
       <w:proofErr w:type="gramStart"/>
+      <w:r>
+        <w:rPr>
+          <w:b/>
+        </w:rPr>
+        <w:t>actually work</w:t>
+      </w:r>
       <w:proofErr w:type="gramEnd"/>
       <w:r>
         <w:rPr>
           <w:b/>
         </w:rPr>
-        <w:t>Did the authors actually work with the data?</w:t>
-      </w:r>
-      <w:r>
-        <w:rPr>
-          <w:b w:val="0"/>
-        </w:rPr>
+        <w:t xml:space="preserve"> with the data?</w:t>
+      </w:r>
+      <w:r>
         <w:t xml:space="preserve"> Or do they only mention it in passing. This score is called </w:t>
       </w:r>
       <w:r>
@@ -1491,9 +1583,6 @@
         <w:t>use</w:t>
       </w:r>
       <w:r>
-        <w:rPr>
-          <w:b w:val="0"/>
-        </w:rPr>
         <w:t>.</w:t>
       </w:r>
     </w:p>
@@ -1502,9 +1591,6 @@
         <w:spacing w:after="100"/>
       </w:pPr>
       <w:r>
-        <w:rPr>
-          <w:b w:val="0"/>
-        </w:rPr>
         <w:t xml:space="preserve">Each piece of evidence is worth 2 points if it is strong and 1 point if it is weak. A paper is counted only if it scores at least 2 for identity </w:t>
       </w:r>
       <w:r>
@@ -1514,10 +1600,15 @@
         <w:t>and</w:t>
       </w:r>
       <w:r>
-        <w:rPr>
-          <w:b w:val="0"/>
-        </w:rPr>
-        <w:t xml:space="preserve"> at least 2 for use. So one strong piece of evidence settles a question on its own, two weak ones together also settle it, and a single weak one never does.</w:t>
+        <w:t xml:space="preserve"> at least 2 for use. </w:t>
+      </w:r>
+      <w:proofErr w:type="gramStart"/>
+      <w:r>
+        <w:t>So</w:t>
+      </w:r>
+      <w:proofErr w:type="gramEnd"/>
+      <w:r>
+        <w:t xml:space="preserve"> one strong piece of evidence settles a question on its own, two weak ones together also settle it, and a single weak one never does.</w:t>
       </w:r>
     </w:p>
     <w:p>
@@ -1525,9 +1616,7 @@
         <w:spacing w:after="100"/>
       </w:pPr>
       <w:r>
-        <w:rPr>
-          <w:b w:val="0"/>
-        </w:rPr>
+        <w:lastRenderedPageBreak/>
         <w:t xml:space="preserve">Scoring the two questions separately is the point of the design. Added into one number, a paper could pass on name recognition alone: mention the survey three times, add a World Bank co-author, and a literature review would outrank a real empirical study. Keeping them apart makes </w:t>
       </w:r>
       <w:r>
@@ -1537,9 +1626,6 @@
         <w:t>“mentions the survey but never uses the data” unable to pass at all</w:t>
       </w:r>
       <w:r>
-        <w:rPr>
-          <w:b w:val="0"/>
-        </w:rPr>
         <w:t>, which the previous version could not prevent.</w:t>
       </w:r>
     </w:p>
@@ -1548,21 +1634,8 @@
         <w:spacing w:after="100"/>
       </w:pPr>
       <w:r>
-        <w:rPr>
-          <w:b w:val="0"/>
-        </w:rPr>
         <w:t>The evidence used for each question is listed below.</w:t>
       </w:r>
-    </w:p>
-    <w:p>
-      <w:r>
-        <w:br w:type="page"/>
-      </w:r>
-    </w:p>
-    <w:p>
-      <w:pPr>
-        <w:spacing w:after="100"/>
-      </w:pPr>
     </w:p>
     <w:tbl>
       <w:tblPr>
@@ -2023,7 +2096,7 @@
                 <w:sz w:val="18"/>
                 <w:szCs w:val="18"/>
               </w:rPr>
-              <w:t>The LSMS programme is named in the abstract</w:t>
+              <w:t>The LSMS program is named in the abstract</w:t>
             </w:r>
           </w:p>
         </w:tc>
@@ -2418,76 +2491,83 @@
       <w:pPr>
         <w:spacing w:after="100"/>
       </w:pPr>
+      <w:r>
+        <w:t>As for the Use score,</w:t>
+      </w:r>
+      <w:r>
+        <w:t xml:space="preserve"> </w:t>
+      </w:r>
+      <w:r>
+        <w:t>e</w:t>
+      </w:r>
+      <w:r>
+        <w:t xml:space="preserve">vidence </w:t>
+      </w:r>
       <w:proofErr w:type="gramStart"/>
+      <w:r>
+        <w:t>has to</w:t>
+      </w:r>
       <w:proofErr w:type="gramEnd"/>
+      <w:r>
+        <w:t xml:space="preserve"> point at </w:t>
+      </w:r>
+      <w:r>
+        <w:rPr>
+          <w:b/>
+        </w:rPr>
+        <w:t>our</w:t>
+      </w:r>
+      <w:r>
+        <w:t xml:space="preserve"> survey specifically. An abstract saying “we use household survey data” shows the authors used some data, not that they used this one. Evidence counts in full only when it is attached to the survey: either the two appear within 40 words of each other in the full text, or the abstract names the survey and describes using data in the same place. Unattached evidence, such as general statistical vocabulary, is capped at 1 point so it can support a real finding but never stand in for one.</w:t>
+      </w:r>
+    </w:p>
+    <w:p>
+      <w:pPr>
+        <w:spacing w:after="100"/>
+      </w:pPr>
+      <w:r>
+        <w:t xml:space="preserve">Because abstracts are short and often say nothing about data sources, a second pass searches the full text of any paper whose use score is still short. It asks whether the survey name appears within 40 words of language describing working with the data. Note that this pass is triggered by a low </w:t>
+      </w:r>
+      <w:r>
+        <w:rPr>
+          <w:b/>
+        </w:rPr>
+        <w:t>use</w:t>
+      </w:r>
+      <w:r>
+        <w:t xml:space="preserve"> score specifically, not a low total: a paper can carry overwhelming evidence that it is the right survey and still </w:t>
+      </w:r>
       <w:proofErr w:type="gramStart"/>
+      <w:r>
+        <w:t>show</w:t>
+      </w:r>
       <w:proofErr w:type="gramEnd"/>
+      <w:r>
+        <w:t xml:space="preserve"> nothing about whether the data was used, and that is exactly the paper worth checking.</w:t>
+      </w:r>
+    </w:p>
+    <w:p>
+      <w:pPr>
+        <w:spacing w:after="100"/>
+      </w:pPr>
+      <w:r>
+        <w:t xml:space="preserve">The phrases it searches for were chosen by measurement rather than intuition. Every candidate phrase was tested against a 36-paper set that had already been assessed by </w:t>
+      </w:r>
       <w:proofErr w:type="gramStart"/>
+      <w:r>
+        <w:t>hand, and</w:t>
+      </w:r>
       <w:proofErr w:type="gramEnd"/>
       <w:r>
-        <w:rPr>
-          <w:b w:val="0"/>
-        </w:rPr>
-        <w:t xml:space="preserve">One rule governs the use score. Evidence has to point at </w:t>
+        <w:t xml:space="preserve"> scored on how many genuine users against how many non-users it caught. “Using data from” separated cleanly, catching 8 real users and 1 non-user. “This paper uses” and “based on the” proved to be </w:t>
       </w:r>
       <w:r>
         <w:rPr>
           <w:b/>
         </w:rPr>
-        <w:t>our</w:t>
-      </w:r>
-      <w:r>
-        <w:rPr>
-          <w:b w:val="0"/>
-        </w:rPr>
-        <w:t xml:space="preserve"> survey specifically. An abstract saying “we use household survey data” shows the authors used some data, not that they used this one. Evidence counts in full only when it is attached to the survey: either the two appear within 40 words of each other in the full text, or the abstract names the survey and describes using data in the same place. Unattached evidence, such as general statistical vocabulary, is capped at 1 point so it can support a real finding but never stand in for one.</w:t>
-      </w:r>
-    </w:p>
-    <w:p>
-      <w:pPr>
-        <w:spacing w:after="100"/>
-      </w:pPr>
-      <w:r>
-        <w:rPr>
-          <w:b w:val="0"/>
-        </w:rPr>
-        <w:t xml:space="preserve">Because abstracts are short and often say nothing about data sources, a second pass searches the full text of any paper whose use score is still short. It asks whether the survey name appears within 40 words of language describing working with the data. Note that this pass is triggered by a low </w:t>
-      </w:r>
-      <w:r>
-        <w:rPr>
-          <w:b/>
-        </w:rPr>
-        <w:t>use</w:t>
-      </w:r>
-      <w:r>
-        <w:rPr>
-          <w:b w:val="0"/>
-        </w:rPr>
-        <w:t xml:space="preserve"> score specifically, not a low total: a paper can carry overwhelming evidence that it is the right survey and still show nothing about whether the data was used, and that is exactly the paper worth checking.</w:t>
-      </w:r>
-    </w:p>
-    <w:p>
-      <w:pPr>
-        <w:spacing w:after="100"/>
-      </w:pPr>
-      <w:proofErr w:type="gramStart"/>
-      <w:proofErr w:type="gramEnd"/>
-      <w:r>
-        <w:rPr>
-          <w:b w:val="0"/>
-        </w:rPr>
-        <w:t xml:space="preserve">The phrases it searches for were chosen by measurement rather than intuition. Every candidate phrase was tested against a 36-paper set that had already been assessed by hand, and scored on how many genuine users against how many non-users it caught. “Using data from” separated cleanly, catching 8 real users and 1 non-user. “This paper uses” and “based on the” proved to be </w:t>
-      </w:r>
-      <w:r>
-        <w:rPr>
-          <w:b/>
-        </w:rPr>
         <w:t>negative</w:t>
       </w:r>
       <w:r>
-        <w:rPr>
-          <w:b w:val="0"/>
-        </w:rPr>
         <w:t xml:space="preserve"> indicators, appearing more often in citations than in real use, and were removed. Citing the World Bank microdata catalogue scored 2 against 2, no separating power at all, so it is recorded on the paper as a note but earns no points.</w:t>
       </w:r>
     </w:p>
@@ -2496,52 +2576,48 @@
         <w:pStyle w:val="Heading2"/>
         <w:spacing w:after="100"/>
       </w:pPr>
+      <w:r>
+        <w:t>2.6 Rules that override the score</w:t>
+      </w:r>
+    </w:p>
+    <w:p>
+      <w:pPr>
+        <w:spacing w:after="100"/>
+      </w:pPr>
+      <w:r>
+        <w:t xml:space="preserve">Two rules sit outside the scoring. Six publication types can never be an empirical use of survey data and are excluded regardless of score: conference abstract, dataset, </w:t>
+      </w:r>
+      <w:proofErr w:type="spellStart"/>
+      <w:r>
+        <w:t>paratext</w:t>
+      </w:r>
+      <w:proofErr w:type="spellEnd"/>
+      <w:r>
+        <w:t>, erratum, letter and software. Editorials are deliberately not on that list.</w:t>
+      </w:r>
+    </w:p>
+    <w:p>
+      <w:pPr>
+        <w:spacing w:after="100"/>
+      </w:pPr>
+      <w:r>
+        <w:t>Literature reviews are held to a higher standard rather than excluded. A review that genuinely re-analyses the data still counts, but it must show one strong piece of attached evidence rather than an accumulation of weak ones, because reviews are the largest single category of papers that name a survey without using it.</w:t>
+      </w:r>
+    </w:p>
+    <w:p>
+      <w:pPr>
+        <w:spacing w:after="100"/>
+      </w:pPr>
+      <w:r>
+        <w:t xml:space="preserve">Every piece of evidence that applied is written </w:t>
+      </w:r>
       <w:proofErr w:type="gramStart"/>
+      <w:r>
+        <w:t>to</w:t>
+      </w:r>
       <w:proofErr w:type="gramEnd"/>
       <w:r>
-        <w:rPr>
-          <w:b w:val="0"/>
-        </w:rPr>
-        <w:t>2.6 Rules that override the score</w:t>
-      </w:r>
-    </w:p>
-    <w:p>
-      <w:pPr>
-        <w:spacing w:after="100"/>
-      </w:pPr>
-      <w:proofErr w:type="gramStart"/>
-      <w:proofErr w:type="gramEnd"/>
-      <w:r>
-        <w:rPr>
-          <w:b w:val="0"/>
-        </w:rPr>
-        <w:t>Two rules sit outside the scoring. Six publication types can never be an empirical use of survey data and are excluded regardless of score: conference abstract, dataset, paratext, erratum, letter and software. Editorials are deliberately not on that list.</w:t>
-      </w:r>
-    </w:p>
-    <w:p>
-      <w:pPr>
-        <w:spacing w:after="100"/>
-      </w:pPr>
-      <w:proofErr w:type="gramStart"/>
-      <w:proofErr w:type="gramEnd"/>
-      <w:r>
-        <w:rPr>
-          <w:b w:val="0"/>
-        </w:rPr>
-        <w:t>Literature reviews are held to a higher standard rather than excluded. A review that genuinely re-analyses the data still counts, but it must show one strong piece of attached evidence rather than an accumulation of weak ones, because reviews are the largest single category of papers that name a survey without using it.</w:t>
-      </w:r>
-    </w:p>
-    <w:p>
-      <w:pPr>
-        <w:spacing w:after="100"/>
-      </w:pPr>
-      <w:proofErr w:type="gramStart"/>
-      <w:proofErr w:type="gramEnd"/>
-      <w:r>
-        <w:rPr>
-          <w:b w:val="0"/>
-        </w:rPr>
-        <w:t>Every piece of evidence that applied is written to the workbook, along with both scores, so any decision can be traced back to its reasons.</w:t>
+        <w:t xml:space="preserve"> the workbook, along with both scores, so any decision can be traced back to its reasons.</w:t>
       </w:r>
     </w:p>
     <w:p>
@@ -2648,13 +2724,8 @@
       <w:r>
         <w:br w:type="page"/>
       </w:r>
-    </w:p>
-    <w:p>
-      <w:pPr>
-        <w:pStyle w:val="Heading2"/>
-        <w:spacing w:before="180" w:after="80"/>
-      </w:pPr>
-      <w:r>
+      <w:r>
+        <w:lastRenderedPageBreak/>
         <w:t>2.9 What the workbook contains</w:t>
       </w:r>
     </w:p>
@@ -2777,7 +2848,25 @@
                 <w:sz w:val="18"/>
                 <w:szCs w:val="18"/>
               </w:rPr>
-              <w:t xml:space="preserve"> and use scores, and the individual signals that fired (relevance_flags).</w:t>
+              <w:t xml:space="preserve"> and use scores, and the individual signals that fired (</w:t>
+            </w:r>
+            <w:proofErr w:type="spellStart"/>
+            <w:r>
+              <w:rPr>
+                <w:color w:val="000000"/>
+                <w:sz w:val="18"/>
+                <w:szCs w:val="18"/>
+              </w:rPr>
+              <w:t>relevance_flags</w:t>
+            </w:r>
+            <w:proofErr w:type="spellEnd"/>
+            <w:r>
+              <w:rPr>
+                <w:color w:val="000000"/>
+                <w:sz w:val="18"/>
+                <w:szCs w:val="18"/>
+              </w:rPr>
+              <w:t>).</w:t>
             </w:r>
           </w:p>
         </w:tc>
@@ -2909,7 +2998,25 @@
                 <w:sz w:val="18"/>
                 <w:szCs w:val="18"/>
               </w:rPr>
-              <w:t>, the matching rule applied, the required country context words, and the exact OpenAlex query sent, so any result can be traced back to the search that found it.</w:t>
+              <w:t xml:space="preserve">, the matching rule applied, the required country context words, and the exact </w:t>
+            </w:r>
+            <w:proofErr w:type="spellStart"/>
+            <w:r>
+              <w:rPr>
+                <w:color w:val="000000"/>
+                <w:sz w:val="18"/>
+                <w:szCs w:val="18"/>
+              </w:rPr>
+              <w:t>OpenAlex</w:t>
+            </w:r>
+            <w:proofErr w:type="spellEnd"/>
+            <w:r>
+              <w:rPr>
+                <w:color w:val="000000"/>
+                <w:sz w:val="18"/>
+                <w:szCs w:val="18"/>
+              </w:rPr>
+              <w:t xml:space="preserve"> query sent, so any result can be traced back to the search that found it.</w:t>
             </w:r>
           </w:p>
         </w:tc>
@@ -3061,7 +3168,23 @@
         </w:rPr>
       </w:pPr>
       <w:r>
-        <w:t>Two kinds of error remain, and both follow from the same constraint. OpenAlex allows the pipeline to ask whether two phrases appear near each other in a paper, but it does not hand over the text itself. The pipeline therefore cannot tell which part of a paper a phrase came from, and a name in the reference list looks the same to it as a name in the methods section.</w:t>
+        <w:t xml:space="preserve">Two kinds of error remain, and both follow from the same constraint. </w:t>
+      </w:r>
+      <w:proofErr w:type="spellStart"/>
+      <w:r>
+        <w:t>OpenAlex</w:t>
+      </w:r>
+      <w:proofErr w:type="spellEnd"/>
+      <w:r>
+        <w:t xml:space="preserve"> allows the pipeline to ask whether two phrases appear near each other in a paper, but it does not hand over the text itself. The pipeline therefore cannot tell which part of a paper a phrase came from, and a name in the reference list looks the </w:t>
+      </w:r>
+      <w:proofErr w:type="gramStart"/>
+      <w:r>
+        <w:t>same to it</w:t>
+      </w:r>
+      <w:proofErr w:type="gramEnd"/>
+      <w:r>
+        <w:t xml:space="preserve"> as a name in the methods section.</w:t>
       </w:r>
     </w:p>
     <w:p>
@@ -3079,9 +3202,6 @@
         <w:t>Reference-only matches.</w:t>
       </w:r>
       <w:r>
-        <w:rPr>
-          <w:b w:val="0"/>
-        </w:rPr>
         <w:t xml:space="preserve"> A paper that cites a survey without using it still contains the survey name, and a dataset citation carries collection language of its own, for example “Uganda National Panel Survey 2019-2020, collected by Uganda Bureau of Statistics”. That is indistinguishable from a methods sentence when only the distance between words is visible. Four papers in the review set are counted this way when they should not be.</w:t>
       </w:r>
     </w:p>
@@ -3100,7 +3220,15 @@
         <w:t>Unindexed data statements.</w:t>
       </w:r>
       <w:r>
-        <w:t xml:space="preserve"> Some papers declare their data in a table or a dataset section that OpenAlex has not indexed. In one verified case the phrase “Living Standards Measurement Study” appears in the paper's own dataset section yet is absent from the index at every query length and proximity setting, while the acronym alone is present. No query formulation reaches that paper.</w:t>
+        <w:t xml:space="preserve"> Some papers declare their data in a table or a dataset section that </w:t>
+      </w:r>
+      <w:proofErr w:type="spellStart"/>
+      <w:r>
+        <w:t>OpenAlex</w:t>
+      </w:r>
+      <w:proofErr w:type="spellEnd"/>
+      <w:r>
+        <w:t xml:space="preserve"> has not indexed. In one verified case the phrase “Living Standards Measurement Study” appears in the paper's own dataset section yet is absent from the index at every query length and proximity setting, while the acronym alone is present. No query formulation reaches that paper.</w:t>
       </w:r>
     </w:p>
     <w:p>

</xml_diff>